<commit_message>
feat: add SOQ template with contractor profile placeholders
Co-Authored-By: Claude Sonnet 4.6 <noreply@anthropic.com>
</commit_message>
<xml_diff>
--- a/app/templates/soq_template.docx
+++ b/app/templates/soq_template.docx
@@ -156,108 +156,7 @@
           <w:szCs w:val="22"/>
           <w:u w:val="single"/>
         </w:rPr>
-        <w:t xml:space="preserve">   </w:t>
-      </w:r>
-      <w:r>
-        <w:rPr>
-          <w:rFonts w:ascii="Times New Roman" w:hAnsi="Times New Roman"/>
-          <w:sz w:val="22"/>
-          <w:szCs w:val="22"/>
-          <w:u w:val="single"/>
-        </w:rPr>
-        <w:fldChar w:fldCharType="begin">
-          <w:ffData>
-            <w:name w:val=""/>
-            <w:enabled/>
-            <w:calcOnExit w:val="0"/>
-            <w:textInput/>
-          </w:ffData>
-        </w:fldChar>
-      </w:r>
-      <w:r>
-        <w:rPr>
-          <w:rFonts w:ascii="Times New Roman" w:hAnsi="Times New Roman"/>
-          <w:sz w:val="22"/>
-          <w:szCs w:val="22"/>
-          <w:u w:val="single"/>
-        </w:rPr>
-        <w:instrText xml:space="preserve"> FORMTEXT </w:instrText>
-      </w:r>
-      <w:r>
-        <w:rPr>
-          <w:rFonts w:ascii="Times New Roman" w:hAnsi="Times New Roman"/>
-          <w:sz w:val="22"/>
-          <w:szCs w:val="22"/>
-          <w:u w:val="single"/>
-        </w:rPr>
-      </w:r>
-      <w:r>
-        <w:rPr>
-          <w:rFonts w:ascii="Times New Roman" w:hAnsi="Times New Roman"/>
-          <w:sz w:val="22"/>
-          <w:szCs w:val="22"/>
-          <w:u w:val="single"/>
-        </w:rPr>
-        <w:fldChar w:fldCharType="separate"/>
-      </w:r>
-      <w:r>
-        <w:rPr>
-          <w:rFonts w:ascii="Times New Roman" w:hAnsi="Times New Roman"/>
-          <w:noProof/>
-          <w:sz w:val="22"/>
-          <w:szCs w:val="22"/>
-          <w:u w:val="single"/>
-        </w:rPr>
-        <w:t> </w:t>
-      </w:r>
-      <w:r>
-        <w:rPr>
-          <w:rFonts w:ascii="Times New Roman" w:hAnsi="Times New Roman"/>
-          <w:noProof/>
-          <w:sz w:val="22"/>
-          <w:szCs w:val="22"/>
-          <w:u w:val="single"/>
-        </w:rPr>
-        <w:t> </w:t>
-      </w:r>
-      <w:r>
-        <w:rPr>
-          <w:rFonts w:ascii="Times New Roman" w:hAnsi="Times New Roman"/>
-          <w:noProof/>
-          <w:sz w:val="22"/>
-          <w:szCs w:val="22"/>
-          <w:u w:val="single"/>
-        </w:rPr>
-        <w:t> </w:t>
-      </w:r>
-      <w:r>
-        <w:rPr>
-          <w:rFonts w:ascii="Times New Roman" w:hAnsi="Times New Roman"/>
-          <w:noProof/>
-          <w:sz w:val="22"/>
-          <w:szCs w:val="22"/>
-          <w:u w:val="single"/>
-        </w:rPr>
-        <w:t> </w:t>
-      </w:r>
-      <w:r>
-        <w:rPr>
-          <w:rFonts w:ascii="Times New Roman" w:hAnsi="Times New Roman"/>
-          <w:noProof/>
-          <w:sz w:val="22"/>
-          <w:szCs w:val="22"/>
-          <w:u w:val="single"/>
-        </w:rPr>
-        <w:t> </w:t>
-      </w:r>
-      <w:r>
-        <w:rPr>
-          <w:rFonts w:ascii="Times New Roman" w:hAnsi="Times New Roman"/>
-          <w:sz w:val="22"/>
-          <w:szCs w:val="22"/>
-          <w:u w:val="single"/>
-        </w:rPr>
-        <w:fldChar w:fldCharType="end"/>
+        <w:t xml:space="preserve">  </w:t>
       </w:r>
       <w:r>
         <w:rPr>
@@ -325,107 +224,6 @@
       <w:r>
         <w:rPr>
           <w:rFonts w:ascii="Times New Roman" w:hAnsi="Times New Roman"/>
-          <w:sz w:val="22"/>
-          <w:szCs w:val="22"/>
-          <w:u w:val="single"/>
-        </w:rPr>
-        <w:fldChar w:fldCharType="begin">
-          <w:ffData>
-            <w:name w:val=""/>
-            <w:enabled/>
-            <w:calcOnExit w:val="0"/>
-            <w:textInput/>
-          </w:ffData>
-        </w:fldChar>
-      </w:r>
-      <w:r>
-        <w:rPr>
-          <w:rFonts w:ascii="Times New Roman" w:hAnsi="Times New Roman"/>
-          <w:sz w:val="22"/>
-          <w:szCs w:val="22"/>
-          <w:u w:val="single"/>
-        </w:rPr>
-        <w:instrText xml:space="preserve"> FORMTEXT </w:instrText>
-      </w:r>
-      <w:r>
-        <w:rPr>
-          <w:rFonts w:ascii="Times New Roman" w:hAnsi="Times New Roman"/>
-          <w:sz w:val="22"/>
-          <w:szCs w:val="22"/>
-          <w:u w:val="single"/>
-        </w:rPr>
-      </w:r>
-      <w:r>
-        <w:rPr>
-          <w:rFonts w:ascii="Times New Roman" w:hAnsi="Times New Roman"/>
-          <w:sz w:val="22"/>
-          <w:szCs w:val="22"/>
-          <w:u w:val="single"/>
-        </w:rPr>
-        <w:fldChar w:fldCharType="separate"/>
-      </w:r>
-      <w:r>
-        <w:rPr>
-          <w:rFonts w:ascii="Times New Roman" w:hAnsi="Times New Roman"/>
-          <w:noProof/>
-          <w:sz w:val="22"/>
-          <w:szCs w:val="22"/>
-          <w:u w:val="single"/>
-        </w:rPr>
-        <w:t> </w:t>
-      </w:r>
-      <w:r>
-        <w:rPr>
-          <w:rFonts w:ascii="Times New Roman" w:hAnsi="Times New Roman"/>
-          <w:noProof/>
-          <w:sz w:val="22"/>
-          <w:szCs w:val="22"/>
-          <w:u w:val="single"/>
-        </w:rPr>
-        <w:t> </w:t>
-      </w:r>
-      <w:r>
-        <w:rPr>
-          <w:rFonts w:ascii="Times New Roman" w:hAnsi="Times New Roman"/>
-          <w:noProof/>
-          <w:sz w:val="22"/>
-          <w:szCs w:val="22"/>
-          <w:u w:val="single"/>
-        </w:rPr>
-        <w:t> </w:t>
-      </w:r>
-      <w:r>
-        <w:rPr>
-          <w:rFonts w:ascii="Times New Roman" w:hAnsi="Times New Roman"/>
-          <w:noProof/>
-          <w:sz w:val="22"/>
-          <w:szCs w:val="22"/>
-          <w:u w:val="single"/>
-        </w:rPr>
-        <w:t> </w:t>
-      </w:r>
-      <w:r>
-        <w:rPr>
-          <w:rFonts w:ascii="Times New Roman" w:hAnsi="Times New Roman"/>
-          <w:noProof/>
-          <w:sz w:val="22"/>
-          <w:szCs w:val="22"/>
-          <w:u w:val="single"/>
-        </w:rPr>
-        <w:t> </w:t>
-      </w:r>
-      <w:r>
-        <w:rPr>
-          <w:rFonts w:ascii="Times New Roman" w:hAnsi="Times New Roman"/>
-          <w:sz w:val="22"/>
-          <w:szCs w:val="22"/>
-          <w:u w:val="single"/>
-        </w:rPr>
-        <w:fldChar w:fldCharType="end"/>
-      </w:r>
-      <w:r>
-        <w:rPr>
-          <w:rFonts w:ascii="Times New Roman" w:hAnsi="Times New Roman"/>
           <w:b/>
           <w:sz w:val="22"/>
           <w:szCs w:val="22"/>
@@ -489,107 +287,6 @@
       <w:r>
         <w:rPr>
           <w:rFonts w:ascii="Times New Roman" w:hAnsi="Times New Roman"/>
-          <w:sz w:val="22"/>
-          <w:szCs w:val="22"/>
-          <w:u w:val="single"/>
-        </w:rPr>
-        <w:fldChar w:fldCharType="begin">
-          <w:ffData>
-            <w:name w:val=""/>
-            <w:enabled/>
-            <w:calcOnExit w:val="0"/>
-            <w:textInput/>
-          </w:ffData>
-        </w:fldChar>
-      </w:r>
-      <w:r>
-        <w:rPr>
-          <w:rFonts w:ascii="Times New Roman" w:hAnsi="Times New Roman"/>
-          <w:sz w:val="22"/>
-          <w:szCs w:val="22"/>
-          <w:u w:val="single"/>
-        </w:rPr>
-        <w:instrText xml:space="preserve"> FORMTEXT </w:instrText>
-      </w:r>
-      <w:r>
-        <w:rPr>
-          <w:rFonts w:ascii="Times New Roman" w:hAnsi="Times New Roman"/>
-          <w:sz w:val="22"/>
-          <w:szCs w:val="22"/>
-          <w:u w:val="single"/>
-        </w:rPr>
-      </w:r>
-      <w:r>
-        <w:rPr>
-          <w:rFonts w:ascii="Times New Roman" w:hAnsi="Times New Roman"/>
-          <w:sz w:val="22"/>
-          <w:szCs w:val="22"/>
-          <w:u w:val="single"/>
-        </w:rPr>
-        <w:fldChar w:fldCharType="separate"/>
-      </w:r>
-      <w:r>
-        <w:rPr>
-          <w:rFonts w:ascii="Times New Roman" w:hAnsi="Times New Roman"/>
-          <w:noProof/>
-          <w:sz w:val="22"/>
-          <w:szCs w:val="22"/>
-          <w:u w:val="single"/>
-        </w:rPr>
-        <w:t> </w:t>
-      </w:r>
-      <w:r>
-        <w:rPr>
-          <w:rFonts w:ascii="Times New Roman" w:hAnsi="Times New Roman"/>
-          <w:noProof/>
-          <w:sz w:val="22"/>
-          <w:szCs w:val="22"/>
-          <w:u w:val="single"/>
-        </w:rPr>
-        <w:t> </w:t>
-      </w:r>
-      <w:r>
-        <w:rPr>
-          <w:rFonts w:ascii="Times New Roman" w:hAnsi="Times New Roman"/>
-          <w:noProof/>
-          <w:sz w:val="22"/>
-          <w:szCs w:val="22"/>
-          <w:u w:val="single"/>
-        </w:rPr>
-        <w:t> </w:t>
-      </w:r>
-      <w:r>
-        <w:rPr>
-          <w:rFonts w:ascii="Times New Roman" w:hAnsi="Times New Roman"/>
-          <w:noProof/>
-          <w:sz w:val="22"/>
-          <w:szCs w:val="22"/>
-          <w:u w:val="single"/>
-        </w:rPr>
-        <w:t> </w:t>
-      </w:r>
-      <w:r>
-        <w:rPr>
-          <w:rFonts w:ascii="Times New Roman" w:hAnsi="Times New Roman"/>
-          <w:noProof/>
-          <w:sz w:val="22"/>
-          <w:szCs w:val="22"/>
-          <w:u w:val="single"/>
-        </w:rPr>
-        <w:t> </w:t>
-      </w:r>
-      <w:r>
-        <w:rPr>
-          <w:rFonts w:ascii="Times New Roman" w:hAnsi="Times New Roman"/>
-          <w:sz w:val="22"/>
-          <w:szCs w:val="22"/>
-          <w:u w:val="single"/>
-        </w:rPr>
-        <w:fldChar w:fldCharType="end"/>
-      </w:r>
-      <w:r>
-        <w:rPr>
-          <w:rFonts w:ascii="Times New Roman" w:hAnsi="Times New Roman"/>
           <w:b/>
           <w:sz w:val="22"/>
           <w:szCs w:val="22"/>
@@ -650,107 +347,6 @@
           <w:u w:val="single"/>
         </w:rPr>
         <w:t xml:space="preserve">   </w:t>
-      </w:r>
-      <w:r>
-        <w:rPr>
-          <w:rFonts w:ascii="Times New Roman" w:hAnsi="Times New Roman"/>
-          <w:sz w:val="22"/>
-          <w:szCs w:val="22"/>
-          <w:u w:val="single"/>
-        </w:rPr>
-        <w:fldChar w:fldCharType="begin">
-          <w:ffData>
-            <w:name w:val=""/>
-            <w:enabled/>
-            <w:calcOnExit w:val="0"/>
-            <w:textInput/>
-          </w:ffData>
-        </w:fldChar>
-      </w:r>
-      <w:r>
-        <w:rPr>
-          <w:rFonts w:ascii="Times New Roman" w:hAnsi="Times New Roman"/>
-          <w:sz w:val="22"/>
-          <w:szCs w:val="22"/>
-          <w:u w:val="single"/>
-        </w:rPr>
-        <w:instrText xml:space="preserve"> FORMTEXT </w:instrText>
-      </w:r>
-      <w:r>
-        <w:rPr>
-          <w:rFonts w:ascii="Times New Roman" w:hAnsi="Times New Roman"/>
-          <w:sz w:val="22"/>
-          <w:szCs w:val="22"/>
-          <w:u w:val="single"/>
-        </w:rPr>
-      </w:r>
-      <w:r>
-        <w:rPr>
-          <w:rFonts w:ascii="Times New Roman" w:hAnsi="Times New Roman"/>
-          <w:sz w:val="22"/>
-          <w:szCs w:val="22"/>
-          <w:u w:val="single"/>
-        </w:rPr>
-        <w:fldChar w:fldCharType="separate"/>
-      </w:r>
-      <w:r>
-        <w:rPr>
-          <w:rFonts w:ascii="Times New Roman" w:hAnsi="Times New Roman"/>
-          <w:noProof/>
-          <w:sz w:val="22"/>
-          <w:szCs w:val="22"/>
-          <w:u w:val="single"/>
-        </w:rPr>
-        <w:t> </w:t>
-      </w:r>
-      <w:r>
-        <w:rPr>
-          <w:rFonts w:ascii="Times New Roman" w:hAnsi="Times New Roman"/>
-          <w:noProof/>
-          <w:sz w:val="22"/>
-          <w:szCs w:val="22"/>
-          <w:u w:val="single"/>
-        </w:rPr>
-        <w:t> </w:t>
-      </w:r>
-      <w:r>
-        <w:rPr>
-          <w:rFonts w:ascii="Times New Roman" w:hAnsi="Times New Roman"/>
-          <w:noProof/>
-          <w:sz w:val="22"/>
-          <w:szCs w:val="22"/>
-          <w:u w:val="single"/>
-        </w:rPr>
-        <w:t> </w:t>
-      </w:r>
-      <w:r>
-        <w:rPr>
-          <w:rFonts w:ascii="Times New Roman" w:hAnsi="Times New Roman"/>
-          <w:noProof/>
-          <w:sz w:val="22"/>
-          <w:szCs w:val="22"/>
-          <w:u w:val="single"/>
-        </w:rPr>
-        <w:t> </w:t>
-      </w:r>
-      <w:r>
-        <w:rPr>
-          <w:rFonts w:ascii="Times New Roman" w:hAnsi="Times New Roman"/>
-          <w:noProof/>
-          <w:sz w:val="22"/>
-          <w:szCs w:val="22"/>
-          <w:u w:val="single"/>
-        </w:rPr>
-        <w:t> </w:t>
-      </w:r>
-      <w:r>
-        <w:rPr>
-          <w:rFonts w:ascii="Times New Roman" w:hAnsi="Times New Roman"/>
-          <w:sz w:val="22"/>
-          <w:szCs w:val="22"/>
-          <w:u w:val="single"/>
-        </w:rPr>
-        <w:fldChar w:fldCharType="end"/>
       </w:r>
       <w:r>
         <w:rPr>
@@ -846,131 +442,6 @@
         </w:rPr>
         <w:t xml:space="preserve"> </w:t>
       </w:r>
-      <w:bookmarkStart w:id="0" w:name="Text61"/>
-      <w:r>
-        <w:rPr>
-          <w:rFonts w:ascii="Times New Roman" w:hAnsi="Times New Roman"/>
-          <w:bCs/>
-          <w:color w:val="000000"/>
-          <w:sz w:val="22"/>
-          <w:szCs w:val="22"/>
-          <w:u w:val="single"/>
-        </w:rPr>
-        <w:fldChar w:fldCharType="begin">
-          <w:ffData>
-            <w:name w:val="Text61"/>
-            <w:enabled/>
-            <w:calcOnExit w:val="0"/>
-            <w:textInput>
-              <w:maxLength w:val="200"/>
-            </w:textInput>
-          </w:ffData>
-        </w:fldChar>
-      </w:r>
-      <w:r>
-        <w:rPr>
-          <w:rFonts w:ascii="Times New Roman" w:hAnsi="Times New Roman"/>
-          <w:bCs/>
-          <w:color w:val="000000"/>
-          <w:sz w:val="22"/>
-          <w:szCs w:val="22"/>
-          <w:u w:val="single"/>
-        </w:rPr>
-        <w:instrText xml:space="preserve"> FORMTEXT </w:instrText>
-      </w:r>
-      <w:r>
-        <w:rPr>
-          <w:rFonts w:ascii="Times New Roman" w:hAnsi="Times New Roman"/>
-          <w:bCs/>
-          <w:color w:val="000000"/>
-          <w:sz w:val="22"/>
-          <w:szCs w:val="22"/>
-          <w:u w:val="single"/>
-        </w:rPr>
-      </w:r>
-      <w:r>
-        <w:rPr>
-          <w:rFonts w:ascii="Times New Roman" w:hAnsi="Times New Roman"/>
-          <w:bCs/>
-          <w:color w:val="000000"/>
-          <w:sz w:val="22"/>
-          <w:szCs w:val="22"/>
-          <w:u w:val="single"/>
-        </w:rPr>
-        <w:fldChar w:fldCharType="separate"/>
-      </w:r>
-      <w:r>
-        <w:rPr>
-          <w:rFonts w:ascii="Times New Roman" w:hAnsi="Times New Roman"/>
-          <w:bCs/>
-          <w:noProof/>
-          <w:color w:val="000000"/>
-          <w:sz w:val="22"/>
-          <w:szCs w:val="22"/>
-          <w:u w:val="single"/>
-        </w:rPr>
-        <w:t> </w:t>
-      </w:r>
-      <w:r>
-        <w:rPr>
-          <w:rFonts w:ascii="Times New Roman" w:hAnsi="Times New Roman"/>
-          <w:bCs/>
-          <w:noProof/>
-          <w:color w:val="000000"/>
-          <w:sz w:val="22"/>
-          <w:szCs w:val="22"/>
-          <w:u w:val="single"/>
-        </w:rPr>
-        <w:t> </w:t>
-      </w:r>
-      <w:r>
-        <w:rPr>
-          <w:rFonts w:ascii="Times New Roman" w:hAnsi="Times New Roman"/>
-          <w:bCs/>
-          <w:noProof/>
-          <w:color w:val="000000"/>
-          <w:sz w:val="22"/>
-          <w:szCs w:val="22"/>
-          <w:u w:val="single"/>
-        </w:rPr>
-        <w:t> </w:t>
-      </w:r>
-      <w:r>
-        <w:rPr>
-          <w:rFonts w:ascii="Times New Roman" w:hAnsi="Times New Roman"/>
-          <w:bCs/>
-          <w:noProof/>
-          <w:color w:val="000000"/>
-          <w:sz w:val="22"/>
-          <w:szCs w:val="22"/>
-          <w:u w:val="single"/>
-        </w:rPr>
-        <w:t> </w:t>
-      </w:r>
-      <w:r>
-        <w:rPr>
-          <w:rFonts w:ascii="Times New Roman" w:hAnsi="Times New Roman"/>
-          <w:bCs/>
-          <w:noProof/>
-          <w:color w:val="000000"/>
-          <w:sz w:val="22"/>
-          <w:szCs w:val="22"/>
-          <w:u w:val="single"/>
-        </w:rPr>
-        <w:t> </w:t>
-      </w:r>
-      <w:r>
-        <w:rPr>
-          <w:rFonts w:ascii="Times New Roman" w:hAnsi="Times New Roman"/>
-          <w:bCs/>
-          <w:color w:val="000000"/>
-          <w:sz w:val="22"/>
-          <w:szCs w:val="22"/>
-          <w:u w:val="single"/>
-        </w:rPr>
-        <w:fldChar w:fldCharType="end"/>
-      </w:r>
-      <w:bookmarkEnd w:id="0"/>
       <w:r>
         <w:rPr>
           <w:rFonts w:ascii="Times New Roman" w:hAnsi="Times New Roman"/>
@@ -1046,20 +517,14 @@
       <w:r>
         <w:rPr>
           <w:rFonts w:ascii="Times New Roman" w:hAnsi="Times New Roman"/>
+          <w:b/>
           <w:bCs/>
           <w:color w:val="000000"/>
           <w:sz w:val="22"/>
           <w:szCs w:val="22"/>
           <w:u w:val="single"/>
         </w:rPr>
-        <w:fldChar w:fldCharType="begin">
-          <w:ffData>
-            <w:name w:val=""/>
-            <w:enabled/>
-            <w:calcOnExit w:val="0"/>
-            <w:textInput/>
-          </w:ffData>
-        </w:fldChar>
+        <w:tab/>
       </w:r>
       <w:r>
         <w:rPr>
@@ -1068,279 +533,43 @@
           <w:color w:val="000000"/>
           <w:sz w:val="22"/>
           <w:szCs w:val="22"/>
-          <w:u w:val="single"/>
-        </w:rPr>
-        <w:instrText xml:space="preserve"> FORMTEXT </w:instrText>
-      </w:r>
-      <w:r>
-        <w:rPr>
-          <w:rFonts w:ascii="Times New Roman" w:hAnsi="Times New Roman"/>
+        </w:rPr>
+        <w:tab/>
+      </w:r>
+      <w:r>
+        <w:rPr>
+          <w:rFonts w:ascii="Times New Roman" w:hAnsi="Times New Roman"/>
+          <w:b/>
           <w:bCs/>
           <w:color w:val="000000"/>
           <w:sz w:val="22"/>
           <w:szCs w:val="22"/>
-          <w:u w:val="single"/>
-        </w:rPr>
-      </w:r>
-      <w:r>
-        <w:rPr>
-          <w:rFonts w:ascii="Times New Roman" w:hAnsi="Times New Roman"/>
+        </w:rPr>
+        <w:t>TELEPHONE:</w:t>
+      </w:r>
+      <w:r>
+        <w:rPr>
+          <w:rFonts w:ascii="Times New Roman" w:hAnsi="Times New Roman"/>
+          <w:b/>
           <w:bCs/>
           <w:color w:val="000000"/>
           <w:sz w:val="22"/>
           <w:szCs w:val="22"/>
           <w:u w:val="single"/>
         </w:rPr>
-        <w:fldChar w:fldCharType="separate"/>
-      </w:r>
-      <w:r>
-        <w:rPr>
-          <w:rFonts w:ascii="Times New Roman" w:hAnsi="Times New Roman"/>
-          <w:bCs/>
-          <w:noProof/>
+        <w:t xml:space="preserve">  </w:t>
+      </w:r>
+      <w:r>
+        <w:rPr>
+          <w:rFonts w:ascii="Times New Roman" w:hAnsi="Times New Roman"/>
+          <w:b/>
+          <w:bCs/>
           <w:color w:val="000000"/>
           <w:sz w:val="22"/>
           <w:szCs w:val="22"/>
           <w:u w:val="single"/>
         </w:rPr>
-        <w:t> </w:t>
-      </w:r>
-      <w:r>
-        <w:rPr>
-          <w:rFonts w:ascii="Times New Roman" w:hAnsi="Times New Roman"/>
-          <w:bCs/>
-          <w:noProof/>
-          <w:color w:val="000000"/>
-          <w:sz w:val="22"/>
-          <w:szCs w:val="22"/>
-          <w:u w:val="single"/>
-        </w:rPr>
-        <w:t> </w:t>
-      </w:r>
-      <w:r>
-        <w:rPr>
-          <w:rFonts w:ascii="Times New Roman" w:hAnsi="Times New Roman"/>
-          <w:bCs/>
-          <w:noProof/>
-          <w:color w:val="000000"/>
-          <w:sz w:val="22"/>
-          <w:szCs w:val="22"/>
-          <w:u w:val="single"/>
-        </w:rPr>
-        <w:t> </w:t>
-      </w:r>
-      <w:r>
-        <w:rPr>
-          <w:rFonts w:ascii="Times New Roman" w:hAnsi="Times New Roman"/>
-          <w:bCs/>
-          <w:noProof/>
-          <w:color w:val="000000"/>
-          <w:sz w:val="22"/>
-          <w:szCs w:val="22"/>
-          <w:u w:val="single"/>
-        </w:rPr>
-        <w:t> </w:t>
-      </w:r>
-      <w:r>
-        <w:rPr>
-          <w:rFonts w:ascii="Times New Roman" w:hAnsi="Times New Roman"/>
-          <w:bCs/>
-          <w:noProof/>
-          <w:color w:val="000000"/>
-          <w:sz w:val="22"/>
-          <w:szCs w:val="22"/>
-          <w:u w:val="single"/>
-        </w:rPr>
-        <w:t> </w:t>
-      </w:r>
-      <w:r>
-        <w:rPr>
-          <w:rFonts w:ascii="Times New Roman" w:hAnsi="Times New Roman"/>
-          <w:bCs/>
-          <w:color w:val="000000"/>
-          <w:sz w:val="22"/>
-          <w:szCs w:val="22"/>
-          <w:u w:val="single"/>
-        </w:rPr>
-        <w:fldChar w:fldCharType="end"/>
-      </w:r>
-      <w:r>
-        <w:rPr>
-          <w:rFonts w:ascii="Times New Roman" w:hAnsi="Times New Roman"/>
-          <w:b/>
-          <w:bCs/>
-          <w:color w:val="000000"/>
-          <w:sz w:val="22"/>
-          <w:szCs w:val="22"/>
-          <w:u w:val="single"/>
-        </w:rPr>
-        <w:tab/>
-      </w:r>
-      <w:r>
-        <w:rPr>
-          <w:rFonts w:ascii="Times New Roman" w:hAnsi="Times New Roman"/>
-          <w:bCs/>
-          <w:color w:val="000000"/>
-          <w:sz w:val="22"/>
-          <w:szCs w:val="22"/>
-        </w:rPr>
-        <w:tab/>
-      </w:r>
-      <w:r>
-        <w:rPr>
-          <w:rFonts w:ascii="Times New Roman" w:hAnsi="Times New Roman"/>
-          <w:b/>
-          <w:bCs/>
-          <w:color w:val="000000"/>
-          <w:sz w:val="22"/>
-          <w:szCs w:val="22"/>
-        </w:rPr>
-        <w:t>TELEPHONE:</w:t>
-      </w:r>
-      <w:r>
-        <w:rPr>
-          <w:rFonts w:ascii="Times New Roman" w:hAnsi="Times New Roman"/>
-          <w:b/>
-          <w:bCs/>
-          <w:color w:val="000000"/>
-          <w:sz w:val="22"/>
-          <w:szCs w:val="22"/>
-          <w:u w:val="single"/>
-        </w:rPr>
-        <w:t xml:space="preserve">  </w:t>
-      </w:r>
-      <w:r>
-        <w:rPr>
-          <w:rFonts w:ascii="Times New Roman" w:hAnsi="Times New Roman"/>
-          <w:b/>
-          <w:bCs/>
-          <w:color w:val="000000"/>
-          <w:sz w:val="22"/>
-          <w:szCs w:val="22"/>
-          <w:u w:val="single"/>
-        </w:rPr>
         <w:t xml:space="preserve"> </w:t>
-      </w:r>
-      <w:r>
-        <w:rPr>
-          <w:rFonts w:ascii="Times New Roman" w:hAnsi="Times New Roman"/>
-          <w:bCs/>
-          <w:color w:val="000000"/>
-          <w:sz w:val="22"/>
-          <w:szCs w:val="22"/>
-          <w:u w:val="single"/>
-        </w:rPr>
-        <w:fldChar w:fldCharType="begin">
-          <w:ffData>
-            <w:name w:val=""/>
-            <w:enabled/>
-            <w:calcOnExit w:val="0"/>
-            <w:textInput/>
-          </w:ffData>
-        </w:fldChar>
-      </w:r>
-      <w:r>
-        <w:rPr>
-          <w:rFonts w:ascii="Times New Roman" w:hAnsi="Times New Roman"/>
-          <w:bCs/>
-          <w:color w:val="000000"/>
-          <w:sz w:val="22"/>
-          <w:szCs w:val="22"/>
-          <w:u w:val="single"/>
-        </w:rPr>
-        <w:instrText xml:space="preserve"> FORMTEXT </w:instrText>
-      </w:r>
-      <w:r>
-        <w:rPr>
-          <w:rFonts w:ascii="Times New Roman" w:hAnsi="Times New Roman"/>
-          <w:bCs/>
-          <w:color w:val="000000"/>
-          <w:sz w:val="22"/>
-          <w:szCs w:val="22"/>
-          <w:u w:val="single"/>
-        </w:rPr>
-      </w:r>
-      <w:r>
-        <w:rPr>
-          <w:rFonts w:ascii="Times New Roman" w:hAnsi="Times New Roman"/>
-          <w:bCs/>
-          <w:color w:val="000000"/>
-          <w:sz w:val="22"/>
-          <w:szCs w:val="22"/>
-          <w:u w:val="single"/>
-        </w:rPr>
-        <w:fldChar w:fldCharType="separate"/>
-      </w:r>
-      <w:r>
-        <w:rPr>
-          <w:rFonts w:ascii="Times New Roman" w:hAnsi="Times New Roman"/>
-          <w:bCs/>
-          <w:noProof/>
-          <w:color w:val="000000"/>
-          <w:sz w:val="22"/>
-          <w:szCs w:val="22"/>
-          <w:u w:val="single"/>
-        </w:rPr>
-        <w:t> </w:t>
-      </w:r>
-      <w:r>
-        <w:rPr>
-          <w:rFonts w:ascii="Times New Roman" w:hAnsi="Times New Roman"/>
-          <w:bCs/>
-          <w:noProof/>
-          <w:color w:val="000000"/>
-          <w:sz w:val="22"/>
-          <w:szCs w:val="22"/>
-          <w:u w:val="single"/>
-        </w:rPr>
-        <w:t> </w:t>
-      </w:r>
-      <w:r>
-        <w:rPr>
-          <w:rFonts w:ascii="Times New Roman" w:hAnsi="Times New Roman"/>
-          <w:bCs/>
-          <w:noProof/>
-          <w:color w:val="000000"/>
-          <w:sz w:val="22"/>
-          <w:szCs w:val="22"/>
-          <w:u w:val="single"/>
-        </w:rPr>
-        <w:t> </w:t>
-      </w:r>
-      <w:r>
-        <w:rPr>
-          <w:rFonts w:ascii="Times New Roman" w:hAnsi="Times New Roman"/>
-          <w:bCs/>
-          <w:noProof/>
-          <w:color w:val="000000"/>
-          <w:sz w:val="22"/>
-          <w:szCs w:val="22"/>
-          <w:u w:val="single"/>
-        </w:rPr>
-        <w:t> </w:t>
-      </w:r>
-      <w:r>
-        <w:rPr>
-          <w:rFonts w:ascii="Times New Roman" w:hAnsi="Times New Roman"/>
-          <w:bCs/>
-          <w:noProof/>
-          <w:color w:val="000000"/>
-          <w:sz w:val="22"/>
-          <w:szCs w:val="22"/>
-          <w:u w:val="single"/>
-        </w:rPr>
-        <w:t> </w:t>
-      </w:r>
-      <w:r>
-        <w:rPr>
-          <w:rFonts w:ascii="Times New Roman" w:hAnsi="Times New Roman"/>
-          <w:bCs/>
-          <w:color w:val="000000"/>
-          <w:sz w:val="22"/>
-          <w:szCs w:val="22"/>
-          <w:u w:val="single"/>
-        </w:rPr>
-        <w:fldChar w:fldCharType="end"/>
       </w:r>
       <w:r>
         <w:rPr>
@@ -1438,127 +667,6 @@
       <w:r>
         <w:rPr>
           <w:rFonts w:ascii="Times New Roman" w:hAnsi="Times New Roman"/>
-          <w:bCs/>
-          <w:color w:val="000000"/>
-          <w:sz w:val="22"/>
-          <w:szCs w:val="22"/>
-          <w:u w:val="single"/>
-        </w:rPr>
-        <w:fldChar w:fldCharType="begin">
-          <w:ffData>
-            <w:name w:val=""/>
-            <w:enabled/>
-            <w:calcOnExit w:val="0"/>
-            <w:textInput/>
-          </w:ffData>
-        </w:fldChar>
-      </w:r>
-      <w:r>
-        <w:rPr>
-          <w:rFonts w:ascii="Times New Roman" w:hAnsi="Times New Roman"/>
-          <w:bCs/>
-          <w:color w:val="000000"/>
-          <w:sz w:val="22"/>
-          <w:szCs w:val="22"/>
-          <w:u w:val="single"/>
-        </w:rPr>
-        <w:instrText xml:space="preserve"> FORMTEXT </w:instrText>
-      </w:r>
-      <w:r>
-        <w:rPr>
-          <w:rFonts w:ascii="Times New Roman" w:hAnsi="Times New Roman"/>
-          <w:bCs/>
-          <w:color w:val="000000"/>
-          <w:sz w:val="22"/>
-          <w:szCs w:val="22"/>
-          <w:u w:val="single"/>
-        </w:rPr>
-      </w:r>
-      <w:r>
-        <w:rPr>
-          <w:rFonts w:ascii="Times New Roman" w:hAnsi="Times New Roman"/>
-          <w:bCs/>
-          <w:color w:val="000000"/>
-          <w:sz w:val="22"/>
-          <w:szCs w:val="22"/>
-          <w:u w:val="single"/>
-        </w:rPr>
-        <w:fldChar w:fldCharType="separate"/>
-      </w:r>
-      <w:r>
-        <w:rPr>
-          <w:rFonts w:ascii="Times New Roman" w:hAnsi="Times New Roman"/>
-          <w:bCs/>
-          <w:noProof/>
-          <w:color w:val="000000"/>
-          <w:sz w:val="22"/>
-          <w:szCs w:val="22"/>
-          <w:u w:val="single"/>
-        </w:rPr>
-        <w:t> </w:t>
-      </w:r>
-      <w:r>
-        <w:rPr>
-          <w:rFonts w:ascii="Times New Roman" w:hAnsi="Times New Roman"/>
-          <w:bCs/>
-          <w:noProof/>
-          <w:color w:val="000000"/>
-          <w:sz w:val="22"/>
-          <w:szCs w:val="22"/>
-          <w:u w:val="single"/>
-        </w:rPr>
-        <w:t> </w:t>
-      </w:r>
-      <w:r>
-        <w:rPr>
-          <w:rFonts w:ascii="Times New Roman" w:hAnsi="Times New Roman"/>
-          <w:bCs/>
-          <w:noProof/>
-          <w:color w:val="000000"/>
-          <w:sz w:val="22"/>
-          <w:szCs w:val="22"/>
-          <w:u w:val="single"/>
-        </w:rPr>
-        <w:t> </w:t>
-      </w:r>
-      <w:r>
-        <w:rPr>
-          <w:rFonts w:ascii="Times New Roman" w:hAnsi="Times New Roman"/>
-          <w:bCs/>
-          <w:noProof/>
-          <w:color w:val="000000"/>
-          <w:sz w:val="22"/>
-          <w:szCs w:val="22"/>
-          <w:u w:val="single"/>
-        </w:rPr>
-        <w:t> </w:t>
-      </w:r>
-      <w:r>
-        <w:rPr>
-          <w:rFonts w:ascii="Times New Roman" w:hAnsi="Times New Roman"/>
-          <w:bCs/>
-          <w:noProof/>
-          <w:color w:val="000000"/>
-          <w:sz w:val="22"/>
-          <w:szCs w:val="22"/>
-          <w:u w:val="single"/>
-        </w:rPr>
-        <w:t> </w:t>
-      </w:r>
-      <w:r>
-        <w:rPr>
-          <w:rFonts w:ascii="Times New Roman" w:hAnsi="Times New Roman"/>
-          <w:bCs/>
-          <w:color w:val="000000"/>
-          <w:sz w:val="22"/>
-          <w:szCs w:val="22"/>
-          <w:u w:val="single"/>
-        </w:rPr>
-        <w:fldChar w:fldCharType="end"/>
-      </w:r>
-      <w:r>
-        <w:rPr>
-          <w:rFonts w:ascii="Times New Roman" w:hAnsi="Times New Roman"/>
           <w:b/>
           <w:sz w:val="22"/>
           <w:szCs w:val="22"/>
@@ -1605,129 +713,6 @@
         </w:rPr>
         <w:t xml:space="preserve">   </w:t>
       </w:r>
-      <w:bookmarkStart w:id="1" w:name="_Hlk13040565"/>
-      <w:r>
-        <w:rPr>
-          <w:rFonts w:ascii="Times New Roman" w:hAnsi="Times New Roman"/>
-          <w:bCs/>
-          <w:color w:val="000000"/>
-          <w:sz w:val="22"/>
-          <w:szCs w:val="22"/>
-          <w:u w:val="single"/>
-        </w:rPr>
-        <w:fldChar w:fldCharType="begin">
-          <w:ffData>
-            <w:name w:val=""/>
-            <w:enabled/>
-            <w:calcOnExit w:val="0"/>
-            <w:textInput/>
-          </w:ffData>
-        </w:fldChar>
-      </w:r>
-      <w:r>
-        <w:rPr>
-          <w:rFonts w:ascii="Times New Roman" w:hAnsi="Times New Roman"/>
-          <w:bCs/>
-          <w:color w:val="000000"/>
-          <w:sz w:val="22"/>
-          <w:szCs w:val="22"/>
-          <w:u w:val="single"/>
-        </w:rPr>
-        <w:instrText xml:space="preserve"> FORMTEXT </w:instrText>
-      </w:r>
-      <w:r>
-        <w:rPr>
-          <w:rFonts w:ascii="Times New Roman" w:hAnsi="Times New Roman"/>
-          <w:bCs/>
-          <w:color w:val="000000"/>
-          <w:sz w:val="22"/>
-          <w:szCs w:val="22"/>
-          <w:u w:val="single"/>
-        </w:rPr>
-      </w:r>
-      <w:r>
-        <w:rPr>
-          <w:rFonts w:ascii="Times New Roman" w:hAnsi="Times New Roman"/>
-          <w:bCs/>
-          <w:color w:val="000000"/>
-          <w:sz w:val="22"/>
-          <w:szCs w:val="22"/>
-          <w:u w:val="single"/>
-        </w:rPr>
-        <w:fldChar w:fldCharType="separate"/>
-      </w:r>
-      <w:r>
-        <w:rPr>
-          <w:rFonts w:ascii="Times New Roman" w:hAnsi="Times New Roman"/>
-          <w:bCs/>
-          <w:noProof/>
-          <w:color w:val="000000"/>
-          <w:sz w:val="22"/>
-          <w:szCs w:val="22"/>
-          <w:u w:val="single"/>
-        </w:rPr>
-        <w:t> </w:t>
-      </w:r>
-      <w:r>
-        <w:rPr>
-          <w:rFonts w:ascii="Times New Roman" w:hAnsi="Times New Roman"/>
-          <w:bCs/>
-          <w:noProof/>
-          <w:color w:val="000000"/>
-          <w:sz w:val="22"/>
-          <w:szCs w:val="22"/>
-          <w:u w:val="single"/>
-        </w:rPr>
-        <w:t> </w:t>
-      </w:r>
-      <w:r>
-        <w:rPr>
-          <w:rFonts w:ascii="Times New Roman" w:hAnsi="Times New Roman"/>
-          <w:bCs/>
-          <w:noProof/>
-          <w:color w:val="000000"/>
-          <w:sz w:val="22"/>
-          <w:szCs w:val="22"/>
-          <w:u w:val="single"/>
-        </w:rPr>
-        <w:t> </w:t>
-      </w:r>
-      <w:r>
-        <w:rPr>
-          <w:rFonts w:ascii="Times New Roman" w:hAnsi="Times New Roman"/>
-          <w:bCs/>
-          <w:noProof/>
-          <w:color w:val="000000"/>
-          <w:sz w:val="22"/>
-          <w:szCs w:val="22"/>
-          <w:u w:val="single"/>
-        </w:rPr>
-        <w:t> </w:t>
-      </w:r>
-      <w:r>
-        <w:rPr>
-          <w:rFonts w:ascii="Times New Roman" w:hAnsi="Times New Roman"/>
-          <w:bCs/>
-          <w:noProof/>
-          <w:color w:val="000000"/>
-          <w:sz w:val="22"/>
-          <w:szCs w:val="22"/>
-          <w:u w:val="single"/>
-        </w:rPr>
-        <w:t> </w:t>
-      </w:r>
-      <w:r>
-        <w:rPr>
-          <w:rFonts w:ascii="Times New Roman" w:hAnsi="Times New Roman"/>
-          <w:bCs/>
-          <w:color w:val="000000"/>
-          <w:sz w:val="22"/>
-          <w:szCs w:val="22"/>
-          <w:u w:val="single"/>
-        </w:rPr>
-        <w:fldChar w:fldCharType="end"/>
-      </w:r>
-      <w:bookmarkEnd w:id="1"/>
       <w:r>
         <w:rPr>
           <w:rFonts w:ascii="Times New Roman" w:hAnsi="Times New Roman"/>
@@ -1855,127 +840,6 @@
       <w:r>
         <w:rPr>
           <w:rFonts w:ascii="Times New Roman" w:hAnsi="Times New Roman"/>
-          <w:bCs/>
-          <w:color w:val="000000"/>
-          <w:sz w:val="22"/>
-          <w:szCs w:val="22"/>
-          <w:u w:val="single"/>
-        </w:rPr>
-        <w:fldChar w:fldCharType="begin">
-          <w:ffData>
-            <w:name w:val=""/>
-            <w:enabled/>
-            <w:calcOnExit w:val="0"/>
-            <w:textInput/>
-          </w:ffData>
-        </w:fldChar>
-      </w:r>
-      <w:r>
-        <w:rPr>
-          <w:rFonts w:ascii="Times New Roman" w:hAnsi="Times New Roman"/>
-          <w:bCs/>
-          <w:color w:val="000000"/>
-          <w:sz w:val="22"/>
-          <w:szCs w:val="22"/>
-          <w:u w:val="single"/>
-        </w:rPr>
-        <w:instrText xml:space="preserve"> FORMTEXT </w:instrText>
-      </w:r>
-      <w:r>
-        <w:rPr>
-          <w:rFonts w:ascii="Times New Roman" w:hAnsi="Times New Roman"/>
-          <w:bCs/>
-          <w:color w:val="000000"/>
-          <w:sz w:val="22"/>
-          <w:szCs w:val="22"/>
-          <w:u w:val="single"/>
-        </w:rPr>
-      </w:r>
-      <w:r>
-        <w:rPr>
-          <w:rFonts w:ascii="Times New Roman" w:hAnsi="Times New Roman"/>
-          <w:bCs/>
-          <w:color w:val="000000"/>
-          <w:sz w:val="22"/>
-          <w:szCs w:val="22"/>
-          <w:u w:val="single"/>
-        </w:rPr>
-        <w:fldChar w:fldCharType="separate"/>
-      </w:r>
-      <w:r>
-        <w:rPr>
-          <w:rFonts w:ascii="Times New Roman" w:hAnsi="Times New Roman"/>
-          <w:bCs/>
-          <w:noProof/>
-          <w:color w:val="000000"/>
-          <w:sz w:val="22"/>
-          <w:szCs w:val="22"/>
-          <w:u w:val="single"/>
-        </w:rPr>
-        <w:t> </w:t>
-      </w:r>
-      <w:r>
-        <w:rPr>
-          <w:rFonts w:ascii="Times New Roman" w:hAnsi="Times New Roman"/>
-          <w:bCs/>
-          <w:noProof/>
-          <w:color w:val="000000"/>
-          <w:sz w:val="22"/>
-          <w:szCs w:val="22"/>
-          <w:u w:val="single"/>
-        </w:rPr>
-        <w:t> </w:t>
-      </w:r>
-      <w:r>
-        <w:rPr>
-          <w:rFonts w:ascii="Times New Roman" w:hAnsi="Times New Roman"/>
-          <w:bCs/>
-          <w:noProof/>
-          <w:color w:val="000000"/>
-          <w:sz w:val="22"/>
-          <w:szCs w:val="22"/>
-          <w:u w:val="single"/>
-        </w:rPr>
-        <w:t> </w:t>
-      </w:r>
-      <w:r>
-        <w:rPr>
-          <w:rFonts w:ascii="Times New Roman" w:hAnsi="Times New Roman"/>
-          <w:bCs/>
-          <w:noProof/>
-          <w:color w:val="000000"/>
-          <w:sz w:val="22"/>
-          <w:szCs w:val="22"/>
-          <w:u w:val="single"/>
-        </w:rPr>
-        <w:t> </w:t>
-      </w:r>
-      <w:r>
-        <w:rPr>
-          <w:rFonts w:ascii="Times New Roman" w:hAnsi="Times New Roman"/>
-          <w:bCs/>
-          <w:noProof/>
-          <w:color w:val="000000"/>
-          <w:sz w:val="22"/>
-          <w:szCs w:val="22"/>
-          <w:u w:val="single"/>
-        </w:rPr>
-        <w:t> </w:t>
-      </w:r>
-      <w:r>
-        <w:rPr>
-          <w:rFonts w:ascii="Times New Roman" w:hAnsi="Times New Roman"/>
-          <w:bCs/>
-          <w:color w:val="000000"/>
-          <w:sz w:val="22"/>
-          <w:szCs w:val="22"/>
-          <w:u w:val="single"/>
-        </w:rPr>
-        <w:fldChar w:fldCharType="end"/>
-      </w:r>
-      <w:r>
-        <w:rPr>
-          <w:rFonts w:ascii="Times New Roman" w:hAnsi="Times New Roman"/>
           <w:b/>
           <w:sz w:val="22"/>
           <w:szCs w:val="22"/>
@@ -2131,107 +995,6 @@
           <w:u w:val="single"/>
         </w:rPr>
         <w:t xml:space="preserve">   </w:t>
-      </w:r>
-      <w:r>
-        <w:rPr>
-          <w:bCs/>
-          <w:color w:val="000000"/>
-          <w:sz w:val="22"/>
-          <w:szCs w:val="22"/>
-          <w:u w:val="single"/>
-        </w:rPr>
-        <w:fldChar w:fldCharType="begin">
-          <w:ffData>
-            <w:name w:val=""/>
-            <w:enabled/>
-            <w:calcOnExit w:val="0"/>
-            <w:textInput/>
-          </w:ffData>
-        </w:fldChar>
-      </w:r>
-      <w:r>
-        <w:rPr>
-          <w:bCs/>
-          <w:color w:val="000000"/>
-          <w:sz w:val="22"/>
-          <w:szCs w:val="22"/>
-          <w:u w:val="single"/>
-        </w:rPr>
-        <w:instrText xml:space="preserve"> FORMTEXT </w:instrText>
-      </w:r>
-      <w:r>
-        <w:rPr>
-          <w:bCs/>
-          <w:color w:val="000000"/>
-          <w:sz w:val="22"/>
-          <w:szCs w:val="22"/>
-          <w:u w:val="single"/>
-        </w:rPr>
-      </w:r>
-      <w:r>
-        <w:rPr>
-          <w:bCs/>
-          <w:color w:val="000000"/>
-          <w:sz w:val="22"/>
-          <w:szCs w:val="22"/>
-          <w:u w:val="single"/>
-        </w:rPr>
-        <w:fldChar w:fldCharType="separate"/>
-      </w:r>
-      <w:r>
-        <w:rPr>
-          <w:bCs/>
-          <w:noProof/>
-          <w:color w:val="000000"/>
-          <w:u w:val="single"/>
-        </w:rPr>
-        <w:t> </w:t>
-      </w:r>
-      <w:r>
-        <w:rPr>
-          <w:bCs/>
-          <w:noProof/>
-          <w:color w:val="000000"/>
-          <w:u w:val="single"/>
-        </w:rPr>
-        <w:t> </w:t>
-      </w:r>
-      <w:r>
-        <w:rPr>
-          <w:bCs/>
-          <w:noProof/>
-          <w:color w:val="000000"/>
-          <w:u w:val="single"/>
-        </w:rPr>
-        <w:t> </w:t>
-      </w:r>
-      <w:r>
-        <w:rPr>
-          <w:bCs/>
-          <w:noProof/>
-          <w:color w:val="000000"/>
-          <w:u w:val="single"/>
-        </w:rPr>
-        <w:t> </w:t>
-      </w:r>
-      <w:r>
-        <w:rPr>
-          <w:bCs/>
-          <w:noProof/>
-          <w:color w:val="000000"/>
-          <w:u w:val="single"/>
-        </w:rPr>
-        <w:t> </w:t>
-      </w:r>
-      <w:r>
-        <w:rPr>
-          <w:bCs/>
-          <w:color w:val="000000"/>
-          <w:sz w:val="22"/>
-          <w:szCs w:val="22"/>
-          <w:u w:val="single"/>
-        </w:rPr>
-        <w:fldChar w:fldCharType="end"/>
       </w:r>
       <w:r>
         <w:rPr>
@@ -2476,7 +1239,7 @@
           <w:u w:val="single"/>
         </w:rPr>
       </w:pPr>
-      <w:bookmarkStart w:id="2" w:name="Text64"/>
+      <w:bookmarkStart w:id="0" w:name="Text64"/>
       <w:r>
         <w:rPr>
           <w:rFonts w:ascii="Times New Roman" w:hAnsi="Times New Roman"/>
@@ -2515,9 +1278,9 @@
           <w:sz w:val="22"/>
           <w:szCs w:val="22"/>
         </w:rPr>
-        <w:t>NAME:</w:t>
-      </w:r>
-      <w:bookmarkEnd w:id="2"/>
+        <w:t>NAME</w:t>
+      </w:r>
+      <w:proofErr w:type="gramStart"/>
       <w:r>
         <w:rPr>
           <w:rFonts w:ascii="Times New Roman" w:hAnsi="Times New Roman"/>
@@ -2525,27 +1288,20 @@
           <w:bCs/>
           <w:sz w:val="22"/>
           <w:szCs w:val="22"/>
-          <w:u w:val="single"/>
-        </w:rPr>
-        <w:t xml:space="preserve">  </w:t>
-      </w:r>
-      <w:r>
-        <w:rPr>
-          <w:rFonts w:ascii="Times New Roman" w:hAnsi="Times New Roman"/>
-          <w:bCs/>
-          <w:color w:val="000000"/>
+        </w:rPr>
+        <w:t>:</w:t>
+      </w:r>
+      <w:bookmarkEnd w:id="0"/>
+      <w:r>
+        <w:rPr>
+          <w:rFonts w:ascii="Times New Roman" w:hAnsi="Times New Roman"/>
+          <w:b/>
+          <w:bCs/>
           <w:sz w:val="22"/>
           <w:szCs w:val="22"/>
           <w:u w:val="single"/>
         </w:rPr>
-        <w:fldChar w:fldCharType="begin">
-          <w:ffData>
-            <w:name w:val=""/>
-            <w:enabled/>
-            <w:calcOnExit w:val="0"/>
-            <w:textInput/>
-          </w:ffData>
-        </w:fldChar>
+        <w:t xml:space="preserve">  </w:t>
       </w:r>
       <w:r>
         <w:rPr>
@@ -2556,8 +1312,9 @@
           <w:szCs w:val="22"/>
           <w:u w:val="single"/>
         </w:rPr>
-        <w:instrText xml:space="preserve"> FORMTEXT </w:instrText>
-      </w:r>
+        <w:t xml:space="preserve">{{ </w:t>
+      </w:r>
+      <w:proofErr w:type="spellStart"/>
       <w:r>
         <w:rPr>
           <w:rFonts w:ascii="Times New Roman" w:hAnsi="Times New Roman"/>
@@ -2567,7 +1324,9 @@
           <w:szCs w:val="22"/>
           <w:u w:val="single"/>
         </w:rPr>
-      </w:r>
+        <w:t>contractor</w:t>
+      </w:r>
+      <w:proofErr w:type="gramEnd"/>
       <w:r>
         <w:rPr>
           <w:rFonts w:ascii="Times New Roman" w:hAnsi="Times New Roman"/>
@@ -2577,78 +1336,43 @@
           <w:szCs w:val="22"/>
           <w:u w:val="single"/>
         </w:rPr>
-        <w:fldChar w:fldCharType="separate"/>
-      </w:r>
-      <w:r>
-        <w:rPr>
-          <w:rFonts w:ascii="Times New Roman" w:hAnsi="Times New Roman"/>
-          <w:bCs/>
-          <w:noProof/>
+        <w:t>_</w:t>
+      </w:r>
+      <w:proofErr w:type="gramStart"/>
+      <w:r>
+        <w:rPr>
+          <w:rFonts w:ascii="Times New Roman" w:hAnsi="Times New Roman"/>
+          <w:bCs/>
           <w:color w:val="000000"/>
           <w:sz w:val="22"/>
           <w:szCs w:val="22"/>
           <w:u w:val="single"/>
         </w:rPr>
-        <w:t> </w:t>
-      </w:r>
-      <w:r>
-        <w:rPr>
-          <w:rFonts w:ascii="Times New Roman" w:hAnsi="Times New Roman"/>
-          <w:bCs/>
-          <w:noProof/>
+        <w:t>name</w:t>
+      </w:r>
+      <w:proofErr w:type="spellEnd"/>
+      <w:r>
+        <w:rPr>
+          <w:rFonts w:ascii="Times New Roman" w:hAnsi="Times New Roman"/>
+          <w:bCs/>
           <w:color w:val="000000"/>
           <w:sz w:val="22"/>
           <w:szCs w:val="22"/>
           <w:u w:val="single"/>
         </w:rPr>
-        <w:t> </w:t>
-      </w:r>
-      <w:r>
-        <w:rPr>
-          <w:rFonts w:ascii="Times New Roman" w:hAnsi="Times New Roman"/>
-          <w:bCs/>
-          <w:noProof/>
+        <w:t xml:space="preserve"> }</w:t>
+      </w:r>
+      <w:proofErr w:type="gramEnd"/>
+      <w:r>
+        <w:rPr>
+          <w:rFonts w:ascii="Times New Roman" w:hAnsi="Times New Roman"/>
+          <w:bCs/>
           <w:color w:val="000000"/>
           <w:sz w:val="22"/>
           <w:szCs w:val="22"/>
           <w:u w:val="single"/>
         </w:rPr>
-        <w:t> </w:t>
-      </w:r>
-      <w:r>
-        <w:rPr>
-          <w:rFonts w:ascii="Times New Roman" w:hAnsi="Times New Roman"/>
-          <w:bCs/>
-          <w:noProof/>
-          <w:color w:val="000000"/>
-          <w:sz w:val="22"/>
-          <w:szCs w:val="22"/>
-          <w:u w:val="single"/>
-        </w:rPr>
-        <w:t> </w:t>
-      </w:r>
-      <w:r>
-        <w:rPr>
-          <w:rFonts w:ascii="Times New Roman" w:hAnsi="Times New Roman"/>
-          <w:bCs/>
-          <w:noProof/>
-          <w:color w:val="000000"/>
-          <w:sz w:val="22"/>
-          <w:szCs w:val="22"/>
-          <w:u w:val="single"/>
-        </w:rPr>
-        <w:t> </w:t>
-      </w:r>
-      <w:r>
-        <w:rPr>
-          <w:rFonts w:ascii="Times New Roman" w:hAnsi="Times New Roman"/>
-          <w:bCs/>
-          <w:color w:val="000000"/>
-          <w:sz w:val="22"/>
-          <w:szCs w:val="22"/>
-          <w:u w:val="single"/>
-        </w:rPr>
-        <w:fldChar w:fldCharType="end"/>
+        <w:t>}</w:t>
       </w:r>
       <w:r>
         <w:rPr>
@@ -2682,7 +1406,7 @@
           <w:u w:val="single"/>
         </w:rPr>
       </w:pPr>
-      <w:bookmarkStart w:id="3" w:name="Text65"/>
+      <w:bookmarkStart w:id="1" w:name="Text65"/>
       <w:r>
         <w:rPr>
           <w:rFonts w:ascii="Times New Roman" w:hAnsi="Times New Roman"/>
@@ -2692,9 +1416,9 @@
           <w:sz w:val="22"/>
           <w:szCs w:val="22"/>
         </w:rPr>
-        <w:t>ADDRESS:</w:t>
-      </w:r>
-      <w:bookmarkEnd w:id="3"/>
+        <w:t>ADDRESS</w:t>
+      </w:r>
+      <w:proofErr w:type="gramStart"/>
       <w:r>
         <w:rPr>
           <w:rFonts w:ascii="Times New Roman" w:hAnsi="Times New Roman"/>
@@ -2703,27 +1427,21 @@
           <w:iCs/>
           <w:sz w:val="22"/>
           <w:szCs w:val="22"/>
-          <w:u w:val="single"/>
-        </w:rPr>
-        <w:t xml:space="preserve">  </w:t>
-      </w:r>
-      <w:r>
-        <w:rPr>
-          <w:rFonts w:ascii="Times New Roman" w:hAnsi="Times New Roman"/>
-          <w:bCs/>
-          <w:color w:val="000000"/>
+        </w:rPr>
+        <w:t>:</w:t>
+      </w:r>
+      <w:bookmarkEnd w:id="1"/>
+      <w:r>
+        <w:rPr>
+          <w:rFonts w:ascii="Times New Roman" w:hAnsi="Times New Roman"/>
+          <w:b/>
+          <w:bCs/>
+          <w:iCs/>
           <w:sz w:val="22"/>
           <w:szCs w:val="22"/>
           <w:u w:val="single"/>
         </w:rPr>
-        <w:fldChar w:fldCharType="begin">
-          <w:ffData>
-            <w:name w:val=""/>
-            <w:enabled/>
-            <w:calcOnExit w:val="0"/>
-            <w:textInput/>
-          </w:ffData>
-        </w:fldChar>
+        <w:t xml:space="preserve">  </w:t>
       </w:r>
       <w:r>
         <w:rPr>
@@ -2734,8 +1452,9 @@
           <w:szCs w:val="22"/>
           <w:u w:val="single"/>
         </w:rPr>
-        <w:instrText xml:space="preserve"> FORMTEXT </w:instrText>
-      </w:r>
+        <w:t>{{ address</w:t>
+      </w:r>
+      <w:proofErr w:type="gramEnd"/>
       <w:r>
         <w:rPr>
           <w:rFonts w:ascii="Times New Roman" w:hAnsi="Times New Roman"/>
@@ -2745,88 +1464,7 @@
           <w:szCs w:val="22"/>
           <w:u w:val="single"/>
         </w:rPr>
-      </w:r>
-      <w:r>
-        <w:rPr>
-          <w:rFonts w:ascii="Times New Roman" w:hAnsi="Times New Roman"/>
-          <w:bCs/>
-          <w:color w:val="000000"/>
-          <w:sz w:val="22"/>
-          <w:szCs w:val="22"/>
-          <w:u w:val="single"/>
-        </w:rPr>
-        <w:fldChar w:fldCharType="separate"/>
-      </w:r>
-      <w:r>
-        <w:rPr>
-          <w:rFonts w:ascii="Times New Roman" w:hAnsi="Times New Roman"/>
-          <w:bCs/>
-          <w:noProof/>
-          <w:color w:val="000000"/>
-          <w:sz w:val="22"/>
-          <w:szCs w:val="22"/>
-          <w:u w:val="single"/>
-        </w:rPr>
-        <w:t> </w:t>
-      </w:r>
-      <w:r>
-        <w:rPr>
-          <w:rFonts w:ascii="Times New Roman" w:hAnsi="Times New Roman"/>
-          <w:bCs/>
-          <w:noProof/>
-          <w:color w:val="000000"/>
-          <w:sz w:val="22"/>
-          <w:szCs w:val="22"/>
-          <w:u w:val="single"/>
-        </w:rPr>
-        <w:t> </w:t>
-      </w:r>
-      <w:r>
-        <w:rPr>
-          <w:rFonts w:ascii="Times New Roman" w:hAnsi="Times New Roman"/>
-          <w:bCs/>
-          <w:noProof/>
-          <w:color w:val="000000"/>
-          <w:sz w:val="22"/>
-          <w:szCs w:val="22"/>
-          <w:u w:val="single"/>
-        </w:rPr>
-        <w:t> </w:t>
-      </w:r>
-      <w:r>
-        <w:rPr>
-          <w:rFonts w:ascii="Times New Roman" w:hAnsi="Times New Roman"/>
-          <w:bCs/>
-          <w:noProof/>
-          <w:color w:val="000000"/>
-          <w:sz w:val="22"/>
-          <w:szCs w:val="22"/>
-          <w:u w:val="single"/>
-        </w:rPr>
-        <w:t> </w:t>
-      </w:r>
-      <w:r>
-        <w:rPr>
-          <w:rFonts w:ascii="Times New Roman" w:hAnsi="Times New Roman"/>
-          <w:bCs/>
-          <w:noProof/>
-          <w:color w:val="000000"/>
-          <w:sz w:val="22"/>
-          <w:szCs w:val="22"/>
-          <w:u w:val="single"/>
-        </w:rPr>
-        <w:t> </w:t>
-      </w:r>
-      <w:r>
-        <w:rPr>
-          <w:rFonts w:ascii="Times New Roman" w:hAnsi="Times New Roman"/>
-          <w:bCs/>
-          <w:color w:val="000000"/>
-          <w:sz w:val="22"/>
-          <w:szCs w:val="22"/>
-          <w:u w:val="single"/>
-        </w:rPr>
-        <w:fldChar w:fldCharType="end"/>
+        <w:t xml:space="preserve"> }}</w:t>
       </w:r>
       <w:r>
         <w:rPr>
@@ -2871,8 +1509,9 @@
           <w:sz w:val="22"/>
           <w:szCs w:val="22"/>
         </w:rPr>
-        <w:t>TELEPHONE:</w:t>
-      </w:r>
+        <w:t>TELEPHONE</w:t>
+      </w:r>
+      <w:proofErr w:type="gramStart"/>
       <w:r>
         <w:rPr>
           <w:rFonts w:ascii="Times New Roman" w:hAnsi="Times New Roman"/>
@@ -2881,27 +1520,20 @@
           <w:iCs/>
           <w:sz w:val="22"/>
           <w:szCs w:val="22"/>
-          <w:u w:val="single"/>
-        </w:rPr>
-        <w:t xml:space="preserve">  </w:t>
-      </w:r>
-      <w:r>
-        <w:rPr>
-          <w:rFonts w:ascii="Times New Roman" w:hAnsi="Times New Roman"/>
-          <w:bCs/>
-          <w:color w:val="000000"/>
+        </w:rPr>
+        <w:t>:</w:t>
+      </w:r>
+      <w:r>
+        <w:rPr>
+          <w:rFonts w:ascii="Times New Roman" w:hAnsi="Times New Roman"/>
+          <w:b/>
+          <w:bCs/>
+          <w:iCs/>
           <w:sz w:val="22"/>
           <w:szCs w:val="22"/>
           <w:u w:val="single"/>
         </w:rPr>
-        <w:fldChar w:fldCharType="begin">
-          <w:ffData>
-            <w:name w:val=""/>
-            <w:enabled/>
-            <w:calcOnExit w:val="0"/>
-            <w:textInput/>
-          </w:ffData>
-        </w:fldChar>
+        <w:t xml:space="preserve">  </w:t>
       </w:r>
       <w:r>
         <w:rPr>
@@ -2912,8 +1544,9 @@
           <w:szCs w:val="22"/>
           <w:u w:val="single"/>
         </w:rPr>
-        <w:instrText xml:space="preserve"> FORMTEXT </w:instrText>
-      </w:r>
+        <w:t>{{ phone</w:t>
+      </w:r>
+      <w:proofErr w:type="gramEnd"/>
       <w:r>
         <w:rPr>
           <w:rFonts w:ascii="Times New Roman" w:hAnsi="Times New Roman"/>
@@ -2923,88 +1556,7 @@
           <w:szCs w:val="22"/>
           <w:u w:val="single"/>
         </w:rPr>
-      </w:r>
-      <w:r>
-        <w:rPr>
-          <w:rFonts w:ascii="Times New Roman" w:hAnsi="Times New Roman"/>
-          <w:bCs/>
-          <w:color w:val="000000"/>
-          <w:sz w:val="22"/>
-          <w:szCs w:val="22"/>
-          <w:u w:val="single"/>
-        </w:rPr>
-        <w:fldChar w:fldCharType="separate"/>
-      </w:r>
-      <w:r>
-        <w:rPr>
-          <w:rFonts w:ascii="Times New Roman" w:hAnsi="Times New Roman"/>
-          <w:bCs/>
-          <w:noProof/>
-          <w:color w:val="000000"/>
-          <w:sz w:val="22"/>
-          <w:szCs w:val="22"/>
-          <w:u w:val="single"/>
-        </w:rPr>
-        <w:t> </w:t>
-      </w:r>
-      <w:r>
-        <w:rPr>
-          <w:rFonts w:ascii="Times New Roman" w:hAnsi="Times New Roman"/>
-          <w:bCs/>
-          <w:noProof/>
-          <w:color w:val="000000"/>
-          <w:sz w:val="22"/>
-          <w:szCs w:val="22"/>
-          <w:u w:val="single"/>
-        </w:rPr>
-        <w:t> </w:t>
-      </w:r>
-      <w:r>
-        <w:rPr>
-          <w:rFonts w:ascii="Times New Roman" w:hAnsi="Times New Roman"/>
-          <w:bCs/>
-          <w:noProof/>
-          <w:color w:val="000000"/>
-          <w:sz w:val="22"/>
-          <w:szCs w:val="22"/>
-          <w:u w:val="single"/>
-        </w:rPr>
-        <w:t> </w:t>
-      </w:r>
-      <w:r>
-        <w:rPr>
-          <w:rFonts w:ascii="Times New Roman" w:hAnsi="Times New Roman"/>
-          <w:bCs/>
-          <w:noProof/>
-          <w:color w:val="000000"/>
-          <w:sz w:val="22"/>
-          <w:szCs w:val="22"/>
-          <w:u w:val="single"/>
-        </w:rPr>
-        <w:t> </w:t>
-      </w:r>
-      <w:r>
-        <w:rPr>
-          <w:rFonts w:ascii="Times New Roman" w:hAnsi="Times New Roman"/>
-          <w:bCs/>
-          <w:noProof/>
-          <w:color w:val="000000"/>
-          <w:sz w:val="22"/>
-          <w:szCs w:val="22"/>
-          <w:u w:val="single"/>
-        </w:rPr>
-        <w:t> </w:t>
-      </w:r>
-      <w:r>
-        <w:rPr>
-          <w:rFonts w:ascii="Times New Roman" w:hAnsi="Times New Roman"/>
-          <w:bCs/>
-          <w:color w:val="000000"/>
-          <w:sz w:val="22"/>
-          <w:szCs w:val="22"/>
-          <w:u w:val="single"/>
-        </w:rPr>
-        <w:fldChar w:fldCharType="end"/>
+        <w:t xml:space="preserve"> }}</w:t>
       </w:r>
       <w:r>
         <w:rPr>
@@ -3090,127 +1642,6 @@
       <w:r>
         <w:rPr>
           <w:rFonts w:ascii="Times New Roman" w:hAnsi="Times New Roman"/>
-          <w:bCs/>
-          <w:color w:val="000000"/>
-          <w:sz w:val="22"/>
-          <w:szCs w:val="22"/>
-          <w:u w:val="single"/>
-        </w:rPr>
-        <w:fldChar w:fldCharType="begin">
-          <w:ffData>
-            <w:name w:val=""/>
-            <w:enabled/>
-            <w:calcOnExit w:val="0"/>
-            <w:textInput/>
-          </w:ffData>
-        </w:fldChar>
-      </w:r>
-      <w:r>
-        <w:rPr>
-          <w:rFonts w:ascii="Times New Roman" w:hAnsi="Times New Roman"/>
-          <w:bCs/>
-          <w:color w:val="000000"/>
-          <w:sz w:val="22"/>
-          <w:szCs w:val="22"/>
-          <w:u w:val="single"/>
-        </w:rPr>
-        <w:instrText xml:space="preserve"> FORMTEXT </w:instrText>
-      </w:r>
-      <w:r>
-        <w:rPr>
-          <w:rFonts w:ascii="Times New Roman" w:hAnsi="Times New Roman"/>
-          <w:bCs/>
-          <w:color w:val="000000"/>
-          <w:sz w:val="22"/>
-          <w:szCs w:val="22"/>
-          <w:u w:val="single"/>
-        </w:rPr>
-      </w:r>
-      <w:r>
-        <w:rPr>
-          <w:rFonts w:ascii="Times New Roman" w:hAnsi="Times New Roman"/>
-          <w:bCs/>
-          <w:color w:val="000000"/>
-          <w:sz w:val="22"/>
-          <w:szCs w:val="22"/>
-          <w:u w:val="single"/>
-        </w:rPr>
-        <w:fldChar w:fldCharType="separate"/>
-      </w:r>
-      <w:r>
-        <w:rPr>
-          <w:rFonts w:ascii="Times New Roman" w:hAnsi="Times New Roman"/>
-          <w:bCs/>
-          <w:noProof/>
-          <w:color w:val="000000"/>
-          <w:sz w:val="22"/>
-          <w:szCs w:val="22"/>
-          <w:u w:val="single"/>
-        </w:rPr>
-        <w:t> </w:t>
-      </w:r>
-      <w:r>
-        <w:rPr>
-          <w:rFonts w:ascii="Times New Roman" w:hAnsi="Times New Roman"/>
-          <w:bCs/>
-          <w:noProof/>
-          <w:color w:val="000000"/>
-          <w:sz w:val="22"/>
-          <w:szCs w:val="22"/>
-          <w:u w:val="single"/>
-        </w:rPr>
-        <w:t> </w:t>
-      </w:r>
-      <w:r>
-        <w:rPr>
-          <w:rFonts w:ascii="Times New Roman" w:hAnsi="Times New Roman"/>
-          <w:bCs/>
-          <w:noProof/>
-          <w:color w:val="000000"/>
-          <w:sz w:val="22"/>
-          <w:szCs w:val="22"/>
-          <w:u w:val="single"/>
-        </w:rPr>
-        <w:t> </w:t>
-      </w:r>
-      <w:r>
-        <w:rPr>
-          <w:rFonts w:ascii="Times New Roman" w:hAnsi="Times New Roman"/>
-          <w:bCs/>
-          <w:noProof/>
-          <w:color w:val="000000"/>
-          <w:sz w:val="22"/>
-          <w:szCs w:val="22"/>
-          <w:u w:val="single"/>
-        </w:rPr>
-        <w:t> </w:t>
-      </w:r>
-      <w:r>
-        <w:rPr>
-          <w:rFonts w:ascii="Times New Roman" w:hAnsi="Times New Roman"/>
-          <w:bCs/>
-          <w:noProof/>
-          <w:color w:val="000000"/>
-          <w:sz w:val="22"/>
-          <w:szCs w:val="22"/>
-          <w:u w:val="single"/>
-        </w:rPr>
-        <w:t> </w:t>
-      </w:r>
-      <w:r>
-        <w:rPr>
-          <w:rFonts w:ascii="Times New Roman" w:hAnsi="Times New Roman"/>
-          <w:bCs/>
-          <w:color w:val="000000"/>
-          <w:sz w:val="22"/>
-          <w:szCs w:val="22"/>
-          <w:u w:val="single"/>
-        </w:rPr>
-        <w:fldChar w:fldCharType="end"/>
-      </w:r>
-      <w:r>
-        <w:rPr>
-          <w:rFonts w:ascii="Times New Roman" w:hAnsi="Times New Roman"/>
           <w:b/>
           <w:bCs/>
           <w:iCs/>
@@ -3275,127 +1706,6 @@
           <w:u w:val="single"/>
         </w:rPr>
         <w:t xml:space="preserve">  </w:t>
-      </w:r>
-      <w:r>
-        <w:rPr>
-          <w:rFonts w:ascii="Times New Roman" w:hAnsi="Times New Roman"/>
-          <w:bCs/>
-          <w:color w:val="000000"/>
-          <w:sz w:val="22"/>
-          <w:szCs w:val="22"/>
-          <w:u w:val="single"/>
-        </w:rPr>
-        <w:fldChar w:fldCharType="begin">
-          <w:ffData>
-            <w:name w:val=""/>
-            <w:enabled/>
-            <w:calcOnExit w:val="0"/>
-            <w:textInput/>
-          </w:ffData>
-        </w:fldChar>
-      </w:r>
-      <w:r>
-        <w:rPr>
-          <w:rFonts w:ascii="Times New Roman" w:hAnsi="Times New Roman"/>
-          <w:bCs/>
-          <w:color w:val="000000"/>
-          <w:sz w:val="22"/>
-          <w:szCs w:val="22"/>
-          <w:u w:val="single"/>
-        </w:rPr>
-        <w:instrText xml:space="preserve"> FORMTEXT </w:instrText>
-      </w:r>
-      <w:r>
-        <w:rPr>
-          <w:rFonts w:ascii="Times New Roman" w:hAnsi="Times New Roman"/>
-          <w:bCs/>
-          <w:color w:val="000000"/>
-          <w:sz w:val="22"/>
-          <w:szCs w:val="22"/>
-          <w:u w:val="single"/>
-        </w:rPr>
-      </w:r>
-      <w:r>
-        <w:rPr>
-          <w:rFonts w:ascii="Times New Roman" w:hAnsi="Times New Roman"/>
-          <w:bCs/>
-          <w:color w:val="000000"/>
-          <w:sz w:val="22"/>
-          <w:szCs w:val="22"/>
-          <w:u w:val="single"/>
-        </w:rPr>
-        <w:fldChar w:fldCharType="separate"/>
-      </w:r>
-      <w:r>
-        <w:rPr>
-          <w:rFonts w:ascii="Times New Roman" w:hAnsi="Times New Roman"/>
-          <w:bCs/>
-          <w:noProof/>
-          <w:color w:val="000000"/>
-          <w:sz w:val="22"/>
-          <w:szCs w:val="22"/>
-          <w:u w:val="single"/>
-        </w:rPr>
-        <w:t> </w:t>
-      </w:r>
-      <w:r>
-        <w:rPr>
-          <w:rFonts w:ascii="Times New Roman" w:hAnsi="Times New Roman"/>
-          <w:bCs/>
-          <w:noProof/>
-          <w:color w:val="000000"/>
-          <w:sz w:val="22"/>
-          <w:szCs w:val="22"/>
-          <w:u w:val="single"/>
-        </w:rPr>
-        <w:t> </w:t>
-      </w:r>
-      <w:r>
-        <w:rPr>
-          <w:rFonts w:ascii="Times New Roman" w:hAnsi="Times New Roman"/>
-          <w:bCs/>
-          <w:noProof/>
-          <w:color w:val="000000"/>
-          <w:sz w:val="22"/>
-          <w:szCs w:val="22"/>
-          <w:u w:val="single"/>
-        </w:rPr>
-        <w:t> </w:t>
-      </w:r>
-      <w:r>
-        <w:rPr>
-          <w:rFonts w:ascii="Times New Roman" w:hAnsi="Times New Roman"/>
-          <w:bCs/>
-          <w:noProof/>
-          <w:color w:val="000000"/>
-          <w:sz w:val="22"/>
-          <w:szCs w:val="22"/>
-          <w:u w:val="single"/>
-        </w:rPr>
-        <w:t> </w:t>
-      </w:r>
-      <w:r>
-        <w:rPr>
-          <w:rFonts w:ascii="Times New Roman" w:hAnsi="Times New Roman"/>
-          <w:bCs/>
-          <w:noProof/>
-          <w:color w:val="000000"/>
-          <w:sz w:val="22"/>
-          <w:szCs w:val="22"/>
-          <w:u w:val="single"/>
-        </w:rPr>
-        <w:t> </w:t>
-      </w:r>
-      <w:r>
-        <w:rPr>
-          <w:rFonts w:ascii="Times New Roman" w:hAnsi="Times New Roman"/>
-          <w:bCs/>
-          <w:color w:val="000000"/>
-          <w:sz w:val="22"/>
-          <w:szCs w:val="22"/>
-          <w:u w:val="single"/>
-        </w:rPr>
-        <w:fldChar w:fldCharType="end"/>
       </w:r>
       <w:r>
         <w:rPr>
@@ -3441,8 +1751,9 @@
           <w:sz w:val="22"/>
           <w:szCs w:val="22"/>
         </w:rPr>
-        <w:t>EMAIL:</w:t>
-      </w:r>
+        <w:t>EMAIL</w:t>
+      </w:r>
+      <w:proofErr w:type="gramStart"/>
       <w:r>
         <w:rPr>
           <w:rFonts w:ascii="Times New Roman" w:hAnsi="Times New Roman"/>
@@ -3451,130 +1762,8 @@
           <w:iCs/>
           <w:sz w:val="22"/>
           <w:szCs w:val="22"/>
-          <w:u w:val="single"/>
-        </w:rPr>
-        <w:t xml:space="preserve">  </w:t>
-      </w:r>
-      <w:r>
-        <w:rPr>
-          <w:rFonts w:ascii="Times New Roman" w:hAnsi="Times New Roman"/>
-          <w:bCs/>
-          <w:color w:val="000000"/>
-          <w:sz w:val="22"/>
-          <w:szCs w:val="22"/>
-          <w:u w:val="single"/>
-        </w:rPr>
-        <w:fldChar w:fldCharType="begin">
-          <w:ffData>
-            <w:name w:val=""/>
-            <w:enabled/>
-            <w:calcOnExit w:val="0"/>
-            <w:textInput/>
-          </w:ffData>
-        </w:fldChar>
-      </w:r>
-      <w:r>
-        <w:rPr>
-          <w:rFonts w:ascii="Times New Roman" w:hAnsi="Times New Roman"/>
-          <w:bCs/>
-          <w:color w:val="000000"/>
-          <w:sz w:val="22"/>
-          <w:szCs w:val="22"/>
-          <w:u w:val="single"/>
-        </w:rPr>
-        <w:instrText xml:space="preserve"> FORMTEXT </w:instrText>
-      </w:r>
-      <w:r>
-        <w:rPr>
-          <w:rFonts w:ascii="Times New Roman" w:hAnsi="Times New Roman"/>
-          <w:bCs/>
-          <w:color w:val="000000"/>
-          <w:sz w:val="22"/>
-          <w:szCs w:val="22"/>
-          <w:u w:val="single"/>
-        </w:rPr>
-      </w:r>
-      <w:r>
-        <w:rPr>
-          <w:rFonts w:ascii="Times New Roman" w:hAnsi="Times New Roman"/>
-          <w:bCs/>
-          <w:color w:val="000000"/>
-          <w:sz w:val="22"/>
-          <w:szCs w:val="22"/>
-          <w:u w:val="single"/>
-        </w:rPr>
-        <w:fldChar w:fldCharType="separate"/>
-      </w:r>
-      <w:r>
-        <w:rPr>
-          <w:rFonts w:ascii="Times New Roman" w:hAnsi="Times New Roman"/>
-          <w:bCs/>
-          <w:noProof/>
-          <w:color w:val="000000"/>
-          <w:sz w:val="22"/>
-          <w:szCs w:val="22"/>
-          <w:u w:val="single"/>
-        </w:rPr>
-        <w:t> </w:t>
-      </w:r>
-      <w:r>
-        <w:rPr>
-          <w:rFonts w:ascii="Times New Roman" w:hAnsi="Times New Roman"/>
-          <w:bCs/>
-          <w:noProof/>
-          <w:color w:val="000000"/>
-          <w:sz w:val="22"/>
-          <w:szCs w:val="22"/>
-          <w:u w:val="single"/>
-        </w:rPr>
-        <w:t> </w:t>
-      </w:r>
-      <w:r>
-        <w:rPr>
-          <w:rFonts w:ascii="Times New Roman" w:hAnsi="Times New Roman"/>
-          <w:bCs/>
-          <w:noProof/>
-          <w:color w:val="000000"/>
-          <w:sz w:val="22"/>
-          <w:szCs w:val="22"/>
-          <w:u w:val="single"/>
-        </w:rPr>
-        <w:t> </w:t>
-      </w:r>
-      <w:r>
-        <w:rPr>
-          <w:rFonts w:ascii="Times New Roman" w:hAnsi="Times New Roman"/>
-          <w:bCs/>
-          <w:noProof/>
-          <w:color w:val="000000"/>
-          <w:sz w:val="22"/>
-          <w:szCs w:val="22"/>
-          <w:u w:val="single"/>
-        </w:rPr>
-        <w:t> </w:t>
-      </w:r>
-      <w:r>
-        <w:rPr>
-          <w:rFonts w:ascii="Times New Roman" w:hAnsi="Times New Roman"/>
-          <w:bCs/>
-          <w:noProof/>
-          <w:color w:val="000000"/>
-          <w:sz w:val="22"/>
-          <w:szCs w:val="22"/>
-          <w:u w:val="single"/>
-        </w:rPr>
-        <w:t> </w:t>
-      </w:r>
-      <w:r>
-        <w:rPr>
-          <w:rFonts w:ascii="Times New Roman" w:hAnsi="Times New Roman"/>
-          <w:bCs/>
-          <w:color w:val="000000"/>
-          <w:sz w:val="22"/>
-          <w:szCs w:val="22"/>
-          <w:u w:val="single"/>
-        </w:rPr>
-        <w:fldChar w:fldCharType="end"/>
+        </w:rPr>
+        <w:t>:</w:t>
       </w:r>
       <w:r>
         <w:rPr>
@@ -3586,7 +1775,53 @@
           <w:szCs w:val="22"/>
           <w:u w:val="single"/>
         </w:rPr>
-        <w:tab/>
+        <w:t xml:space="preserve">  </w:t>
+      </w:r>
+      <w:r>
+        <w:rPr>
+          <w:rFonts w:ascii="Times New Roman" w:hAnsi="Times New Roman"/>
+          <w:bCs/>
+          <w:color w:val="000000"/>
+          <w:sz w:val="22"/>
+          <w:szCs w:val="22"/>
+          <w:u w:val="single"/>
+        </w:rPr>
+        <w:t>{</w:t>
+      </w:r>
+      <w:proofErr w:type="gramEnd"/>
+      <w:r>
+        <w:rPr>
+          <w:rFonts w:ascii="Times New Roman" w:hAnsi="Times New Roman"/>
+          <w:bCs/>
+          <w:color w:val="000000"/>
+          <w:sz w:val="22"/>
+          <w:szCs w:val="22"/>
+          <w:u w:val="single"/>
+        </w:rPr>
+        <w:t xml:space="preserve">{ </w:t>
+      </w:r>
+      <w:hyperlink r:id="rId8" w:history="1">
+        <w:r>
+          <w:rPr>
+            <w:rStyle w:val="Hyperlink"/>
+            <w:rFonts w:ascii="Times New Roman" w:hAnsi="Times New Roman"/>
+            <w:bCs/>
+            <w:sz w:val="22"/>
+            <w:szCs w:val="22"/>
+          </w:rPr>
+          <w:t>rkearns@balfourbeattyus.com</w:t>
+        </w:r>
+      </w:hyperlink>
+      <w:r>
+        <w:rPr>
+          <w:rFonts w:ascii="Times New Roman" w:hAnsi="Times New Roman"/>
+          <w:bCs/>
+          <w:color w:val="000000"/>
+          <w:sz w:val="22"/>
+          <w:szCs w:val="22"/>
+          <w:u w:val="single"/>
+        </w:rPr>
+        <w:t xml:space="preserve"> }}</w:t>
       </w:r>
       <w:r>
         <w:rPr>
@@ -3596,6 +1831,7 @@
           <w:iCs/>
           <w:sz w:val="22"/>
           <w:szCs w:val="22"/>
+          <w:u w:val="single"/>
         </w:rPr>
         <w:tab/>
       </w:r>
@@ -3604,10 +1840,11 @@
           <w:rFonts w:ascii="Times New Roman" w:hAnsi="Times New Roman"/>
           <w:b/>
           <w:bCs/>
+          <w:iCs/>
           <w:sz w:val="22"/>
           <w:szCs w:val="22"/>
         </w:rPr>
-        <w:t>DATE:</w:t>
+        <w:tab/>
       </w:r>
       <w:r>
         <w:rPr>
@@ -3616,130 +1853,19 @@
           <w:bCs/>
           <w:sz w:val="22"/>
           <w:szCs w:val="22"/>
-          <w:u w:val="single"/>
-        </w:rPr>
-        <w:t xml:space="preserve">  </w:t>
-      </w:r>
-      <w:r>
-        <w:rPr>
-          <w:rFonts w:ascii="Times New Roman" w:hAnsi="Times New Roman"/>
-          <w:bCs/>
-          <w:color w:val="000000"/>
+        </w:rPr>
+        <w:t>DATE:</w:t>
+      </w:r>
+      <w:r>
+        <w:rPr>
+          <w:rFonts w:ascii="Times New Roman" w:hAnsi="Times New Roman"/>
+          <w:b/>
+          <w:bCs/>
           <w:sz w:val="22"/>
           <w:szCs w:val="22"/>
           <w:u w:val="single"/>
         </w:rPr>
-        <w:fldChar w:fldCharType="begin">
-          <w:ffData>
-            <w:name w:val=""/>
-            <w:enabled/>
-            <w:calcOnExit w:val="0"/>
-            <w:textInput/>
-          </w:ffData>
-        </w:fldChar>
-      </w:r>
-      <w:r>
-        <w:rPr>
-          <w:rFonts w:ascii="Times New Roman" w:hAnsi="Times New Roman"/>
-          <w:bCs/>
-          <w:color w:val="000000"/>
-          <w:sz w:val="22"/>
-          <w:szCs w:val="22"/>
-          <w:u w:val="single"/>
-        </w:rPr>
-        <w:instrText xml:space="preserve"> FORMTEXT </w:instrText>
-      </w:r>
-      <w:r>
-        <w:rPr>
-          <w:rFonts w:ascii="Times New Roman" w:hAnsi="Times New Roman"/>
-          <w:bCs/>
-          <w:color w:val="000000"/>
-          <w:sz w:val="22"/>
-          <w:szCs w:val="22"/>
-          <w:u w:val="single"/>
-        </w:rPr>
-      </w:r>
-      <w:r>
-        <w:rPr>
-          <w:rFonts w:ascii="Times New Roman" w:hAnsi="Times New Roman"/>
-          <w:bCs/>
-          <w:color w:val="000000"/>
-          <w:sz w:val="22"/>
-          <w:szCs w:val="22"/>
-          <w:u w:val="single"/>
-        </w:rPr>
-        <w:fldChar w:fldCharType="separate"/>
-      </w:r>
-      <w:r>
-        <w:rPr>
-          <w:rFonts w:ascii="Times New Roman" w:hAnsi="Times New Roman"/>
-          <w:bCs/>
-          <w:noProof/>
-          <w:color w:val="000000"/>
-          <w:sz w:val="22"/>
-          <w:szCs w:val="22"/>
-          <w:u w:val="single"/>
-        </w:rPr>
-        <w:t> </w:t>
-      </w:r>
-      <w:r>
-        <w:rPr>
-          <w:rFonts w:ascii="Times New Roman" w:hAnsi="Times New Roman"/>
-          <w:bCs/>
-          <w:noProof/>
-          <w:color w:val="000000"/>
-          <w:sz w:val="22"/>
-          <w:szCs w:val="22"/>
-          <w:u w:val="single"/>
-        </w:rPr>
-        <w:t> </w:t>
-      </w:r>
-      <w:r>
-        <w:rPr>
-          <w:rFonts w:ascii="Times New Roman" w:hAnsi="Times New Roman"/>
-          <w:bCs/>
-          <w:noProof/>
-          <w:color w:val="000000"/>
-          <w:sz w:val="22"/>
-          <w:szCs w:val="22"/>
-          <w:u w:val="single"/>
-        </w:rPr>
-        <w:t> </w:t>
-      </w:r>
-      <w:r>
-        <w:rPr>
-          <w:rFonts w:ascii="Times New Roman" w:hAnsi="Times New Roman"/>
-          <w:bCs/>
-          <w:noProof/>
-          <w:color w:val="000000"/>
-          <w:sz w:val="22"/>
-          <w:szCs w:val="22"/>
-          <w:u w:val="single"/>
-        </w:rPr>
-        <w:t> </w:t>
-      </w:r>
-      <w:r>
-        <w:rPr>
-          <w:rFonts w:ascii="Times New Roman" w:hAnsi="Times New Roman"/>
-          <w:bCs/>
-          <w:noProof/>
-          <w:color w:val="000000"/>
-          <w:sz w:val="22"/>
-          <w:szCs w:val="22"/>
-          <w:u w:val="single"/>
-        </w:rPr>
-        <w:t> </w:t>
-      </w:r>
-      <w:r>
-        <w:rPr>
-          <w:rFonts w:ascii="Times New Roman" w:hAnsi="Times New Roman"/>
-          <w:bCs/>
-          <w:color w:val="000000"/>
-          <w:sz w:val="22"/>
-          <w:szCs w:val="22"/>
-          <w:u w:val="single"/>
-        </w:rPr>
-        <w:fldChar w:fldCharType="end"/>
+        <w:t xml:space="preserve">  </w:t>
       </w:r>
       <w:r>
         <w:rPr>
@@ -3827,8 +1953,9 @@
           <w:sz w:val="22"/>
           <w:szCs w:val="22"/>
         </w:rPr>
-        <w:t>SC Contractor's License Number(s):</w:t>
-      </w:r>
+        <w:t>SC Contractor's License Number(s)</w:t>
+      </w:r>
+      <w:proofErr w:type="gramStart"/>
       <w:r>
         <w:rPr>
           <w:rFonts w:ascii="Times New Roman" w:hAnsi="Times New Roman"/>
@@ -3837,27 +1964,20 @@
           <w:iCs/>
           <w:sz w:val="22"/>
           <w:szCs w:val="22"/>
-          <w:u w:val="single"/>
-        </w:rPr>
-        <w:t xml:space="preserve">  </w:t>
-      </w:r>
-      <w:r>
-        <w:rPr>
-          <w:rFonts w:ascii="Times New Roman" w:hAnsi="Times New Roman"/>
-          <w:bCs/>
-          <w:color w:val="000000"/>
+        </w:rPr>
+        <w:t>:</w:t>
+      </w:r>
+      <w:r>
+        <w:rPr>
+          <w:rFonts w:ascii="Times New Roman" w:hAnsi="Times New Roman"/>
+          <w:b/>
+          <w:bCs/>
+          <w:iCs/>
           <w:sz w:val="22"/>
           <w:szCs w:val="22"/>
           <w:u w:val="single"/>
         </w:rPr>
-        <w:fldChar w:fldCharType="begin">
-          <w:ffData>
-            <w:name w:val=""/>
-            <w:enabled/>
-            <w:calcOnExit w:val="0"/>
-            <w:textInput/>
-          </w:ffData>
-        </w:fldChar>
+        <w:t xml:space="preserve">  </w:t>
       </w:r>
       <w:r>
         <w:rPr>
@@ -3868,8 +1988,9 @@
           <w:szCs w:val="22"/>
           <w:u w:val="single"/>
         </w:rPr>
-        <w:instrText xml:space="preserve"> FORMTEXT </w:instrText>
-      </w:r>
+        <w:t xml:space="preserve">{{ </w:t>
+      </w:r>
+      <w:proofErr w:type="spellStart"/>
       <w:r>
         <w:rPr>
           <w:rFonts w:ascii="Times New Roman" w:hAnsi="Times New Roman"/>
@@ -3879,7 +2000,9 @@
           <w:szCs w:val="22"/>
           <w:u w:val="single"/>
         </w:rPr>
-      </w:r>
+        <w:t>license</w:t>
+      </w:r>
+      <w:proofErr w:type="gramEnd"/>
       <w:r>
         <w:rPr>
           <w:rFonts w:ascii="Times New Roman" w:hAnsi="Times New Roman"/>
@@ -3889,78 +2012,43 @@
           <w:szCs w:val="22"/>
           <w:u w:val="single"/>
         </w:rPr>
-        <w:fldChar w:fldCharType="separate"/>
-      </w:r>
-      <w:r>
-        <w:rPr>
-          <w:rFonts w:ascii="Times New Roman" w:hAnsi="Times New Roman"/>
-          <w:bCs/>
-          <w:noProof/>
+        <w:t>_</w:t>
+      </w:r>
+      <w:proofErr w:type="gramStart"/>
+      <w:r>
+        <w:rPr>
+          <w:rFonts w:ascii="Times New Roman" w:hAnsi="Times New Roman"/>
+          <w:bCs/>
           <w:color w:val="000000"/>
           <w:sz w:val="22"/>
           <w:szCs w:val="22"/>
           <w:u w:val="single"/>
         </w:rPr>
-        <w:t> </w:t>
-      </w:r>
-      <w:r>
-        <w:rPr>
-          <w:rFonts w:ascii="Times New Roman" w:hAnsi="Times New Roman"/>
-          <w:bCs/>
-          <w:noProof/>
+        <w:t>number</w:t>
+      </w:r>
+      <w:proofErr w:type="spellEnd"/>
+      <w:r>
+        <w:rPr>
+          <w:rFonts w:ascii="Times New Roman" w:hAnsi="Times New Roman"/>
+          <w:bCs/>
           <w:color w:val="000000"/>
           <w:sz w:val="22"/>
           <w:szCs w:val="22"/>
           <w:u w:val="single"/>
         </w:rPr>
-        <w:t> </w:t>
-      </w:r>
-      <w:r>
-        <w:rPr>
-          <w:rFonts w:ascii="Times New Roman" w:hAnsi="Times New Roman"/>
-          <w:bCs/>
-          <w:noProof/>
+        <w:t xml:space="preserve"> }</w:t>
+      </w:r>
+      <w:proofErr w:type="gramEnd"/>
+      <w:r>
+        <w:rPr>
+          <w:rFonts w:ascii="Times New Roman" w:hAnsi="Times New Roman"/>
+          <w:bCs/>
           <w:color w:val="000000"/>
           <w:sz w:val="22"/>
           <w:szCs w:val="22"/>
           <w:u w:val="single"/>
         </w:rPr>
-        <w:t> </w:t>
-      </w:r>
-      <w:r>
-        <w:rPr>
-          <w:rFonts w:ascii="Times New Roman" w:hAnsi="Times New Roman"/>
-          <w:bCs/>
-          <w:noProof/>
-          <w:color w:val="000000"/>
-          <w:sz w:val="22"/>
-          <w:szCs w:val="22"/>
-          <w:u w:val="single"/>
-        </w:rPr>
-        <w:t> </w:t>
-      </w:r>
-      <w:r>
-        <w:rPr>
-          <w:rFonts w:ascii="Times New Roman" w:hAnsi="Times New Roman"/>
-          <w:bCs/>
-          <w:noProof/>
-          <w:color w:val="000000"/>
-          <w:sz w:val="22"/>
-          <w:szCs w:val="22"/>
-          <w:u w:val="single"/>
-        </w:rPr>
-        <w:t> </w:t>
-      </w:r>
-      <w:r>
-        <w:rPr>
-          <w:rFonts w:ascii="Times New Roman" w:hAnsi="Times New Roman"/>
-          <w:bCs/>
-          <w:color w:val="000000"/>
-          <w:sz w:val="22"/>
-          <w:szCs w:val="22"/>
-          <w:u w:val="single"/>
-        </w:rPr>
-        <w:fldChar w:fldCharType="end"/>
+        <w:t>}</w:t>
       </w:r>
       <w:r>
         <w:rPr>
@@ -4005,8 +2093,9 @@
           <w:sz w:val="22"/>
           <w:szCs w:val="22"/>
         </w:rPr>
-        <w:t>Classification(s) &amp; Limits:</w:t>
-      </w:r>
+        <w:t>Classification(s) &amp; Limits</w:t>
+      </w:r>
+      <w:proofErr w:type="gramStart"/>
       <w:r>
         <w:rPr>
           <w:rFonts w:ascii="Times New Roman" w:hAnsi="Times New Roman"/>
@@ -4015,27 +2104,20 @@
           <w:iCs/>
           <w:sz w:val="22"/>
           <w:szCs w:val="22"/>
-          <w:u w:val="single"/>
-        </w:rPr>
-        <w:t xml:space="preserve">  </w:t>
-      </w:r>
-      <w:r>
-        <w:rPr>
-          <w:rFonts w:ascii="Times New Roman" w:hAnsi="Times New Roman"/>
-          <w:bCs/>
-          <w:color w:val="000000"/>
+        </w:rPr>
+        <w:t>:</w:t>
+      </w:r>
+      <w:r>
+        <w:rPr>
+          <w:rFonts w:ascii="Times New Roman" w:hAnsi="Times New Roman"/>
+          <w:b/>
+          <w:bCs/>
+          <w:iCs/>
           <w:sz w:val="22"/>
           <w:szCs w:val="22"/>
           <w:u w:val="single"/>
         </w:rPr>
-        <w:fldChar w:fldCharType="begin">
-          <w:ffData>
-            <w:name w:val=""/>
-            <w:enabled/>
-            <w:calcOnExit w:val="0"/>
-            <w:textInput/>
-          </w:ffData>
-        </w:fldChar>
+        <w:t xml:space="preserve">  </w:t>
       </w:r>
       <w:r>
         <w:rPr>
@@ -4046,8 +2128,9 @@
           <w:szCs w:val="22"/>
           <w:u w:val="single"/>
         </w:rPr>
-        <w:instrText xml:space="preserve"> FORMTEXT </w:instrText>
-      </w:r>
+        <w:t>{{ classifications</w:t>
+      </w:r>
+      <w:proofErr w:type="gramEnd"/>
       <w:r>
         <w:rPr>
           <w:rFonts w:ascii="Times New Roman" w:hAnsi="Times New Roman"/>
@@ -4057,88 +2140,7 @@
           <w:szCs w:val="22"/>
           <w:u w:val="single"/>
         </w:rPr>
-      </w:r>
-      <w:r>
-        <w:rPr>
-          <w:rFonts w:ascii="Times New Roman" w:hAnsi="Times New Roman"/>
-          <w:bCs/>
-          <w:color w:val="000000"/>
-          <w:sz w:val="22"/>
-          <w:szCs w:val="22"/>
-          <w:u w:val="single"/>
-        </w:rPr>
-        <w:fldChar w:fldCharType="separate"/>
-      </w:r>
-      <w:r>
-        <w:rPr>
-          <w:rFonts w:ascii="Times New Roman" w:hAnsi="Times New Roman"/>
-          <w:bCs/>
-          <w:noProof/>
-          <w:color w:val="000000"/>
-          <w:sz w:val="22"/>
-          <w:szCs w:val="22"/>
-          <w:u w:val="single"/>
-        </w:rPr>
-        <w:t> </w:t>
-      </w:r>
-      <w:r>
-        <w:rPr>
-          <w:rFonts w:ascii="Times New Roman" w:hAnsi="Times New Roman"/>
-          <w:bCs/>
-          <w:noProof/>
-          <w:color w:val="000000"/>
-          <w:sz w:val="22"/>
-          <w:szCs w:val="22"/>
-          <w:u w:val="single"/>
-        </w:rPr>
-        <w:t> </w:t>
-      </w:r>
-      <w:r>
-        <w:rPr>
-          <w:rFonts w:ascii="Times New Roman" w:hAnsi="Times New Roman"/>
-          <w:bCs/>
-          <w:noProof/>
-          <w:color w:val="000000"/>
-          <w:sz w:val="22"/>
-          <w:szCs w:val="22"/>
-          <w:u w:val="single"/>
-        </w:rPr>
-        <w:t> </w:t>
-      </w:r>
-      <w:r>
-        <w:rPr>
-          <w:rFonts w:ascii="Times New Roman" w:hAnsi="Times New Roman"/>
-          <w:bCs/>
-          <w:noProof/>
-          <w:color w:val="000000"/>
-          <w:sz w:val="22"/>
-          <w:szCs w:val="22"/>
-          <w:u w:val="single"/>
-        </w:rPr>
-        <w:t> </w:t>
-      </w:r>
-      <w:r>
-        <w:rPr>
-          <w:rFonts w:ascii="Times New Roman" w:hAnsi="Times New Roman"/>
-          <w:bCs/>
-          <w:noProof/>
-          <w:color w:val="000000"/>
-          <w:sz w:val="22"/>
-          <w:szCs w:val="22"/>
-          <w:u w:val="single"/>
-        </w:rPr>
-        <w:t> </w:t>
-      </w:r>
-      <w:r>
-        <w:rPr>
-          <w:rFonts w:ascii="Times New Roman" w:hAnsi="Times New Roman"/>
-          <w:bCs/>
-          <w:color w:val="000000"/>
-          <w:sz w:val="22"/>
-          <w:szCs w:val="22"/>
-          <w:u w:val="single"/>
-        </w:rPr>
-        <w:fldChar w:fldCharType="end"/>
+        <w:t xml:space="preserve"> }}</w:t>
       </w:r>
       <w:r>
         <w:rPr>
@@ -4196,127 +2198,6 @@
           <w:u w:val="single"/>
         </w:rPr>
         <w:t xml:space="preserve">  </w:t>
-      </w:r>
-      <w:r>
-        <w:rPr>
-          <w:rFonts w:ascii="Times New Roman" w:hAnsi="Times New Roman"/>
-          <w:bCs/>
-          <w:color w:val="000000"/>
-          <w:sz w:val="22"/>
-          <w:szCs w:val="22"/>
-          <w:u w:val="single"/>
-        </w:rPr>
-        <w:fldChar w:fldCharType="begin">
-          <w:ffData>
-            <w:name w:val=""/>
-            <w:enabled/>
-            <w:calcOnExit w:val="0"/>
-            <w:textInput/>
-          </w:ffData>
-        </w:fldChar>
-      </w:r>
-      <w:r>
-        <w:rPr>
-          <w:rFonts w:ascii="Times New Roman" w:hAnsi="Times New Roman"/>
-          <w:bCs/>
-          <w:color w:val="000000"/>
-          <w:sz w:val="22"/>
-          <w:szCs w:val="22"/>
-          <w:u w:val="single"/>
-        </w:rPr>
-        <w:instrText xml:space="preserve"> FORMTEXT </w:instrText>
-      </w:r>
-      <w:r>
-        <w:rPr>
-          <w:rFonts w:ascii="Times New Roman" w:hAnsi="Times New Roman"/>
-          <w:bCs/>
-          <w:color w:val="000000"/>
-          <w:sz w:val="22"/>
-          <w:szCs w:val="22"/>
-          <w:u w:val="single"/>
-        </w:rPr>
-      </w:r>
-      <w:r>
-        <w:rPr>
-          <w:rFonts w:ascii="Times New Roman" w:hAnsi="Times New Roman"/>
-          <w:bCs/>
-          <w:color w:val="000000"/>
-          <w:sz w:val="22"/>
-          <w:szCs w:val="22"/>
-          <w:u w:val="single"/>
-        </w:rPr>
-        <w:fldChar w:fldCharType="separate"/>
-      </w:r>
-      <w:r>
-        <w:rPr>
-          <w:rFonts w:ascii="Times New Roman" w:hAnsi="Times New Roman"/>
-          <w:bCs/>
-          <w:noProof/>
-          <w:color w:val="000000"/>
-          <w:sz w:val="22"/>
-          <w:szCs w:val="22"/>
-          <w:u w:val="single"/>
-        </w:rPr>
-        <w:t> </w:t>
-      </w:r>
-      <w:r>
-        <w:rPr>
-          <w:rFonts w:ascii="Times New Roman" w:hAnsi="Times New Roman"/>
-          <w:bCs/>
-          <w:noProof/>
-          <w:color w:val="000000"/>
-          <w:sz w:val="22"/>
-          <w:szCs w:val="22"/>
-          <w:u w:val="single"/>
-        </w:rPr>
-        <w:t> </w:t>
-      </w:r>
-      <w:r>
-        <w:rPr>
-          <w:rFonts w:ascii="Times New Roman" w:hAnsi="Times New Roman"/>
-          <w:bCs/>
-          <w:noProof/>
-          <w:color w:val="000000"/>
-          <w:sz w:val="22"/>
-          <w:szCs w:val="22"/>
-          <w:u w:val="single"/>
-        </w:rPr>
-        <w:t> </w:t>
-      </w:r>
-      <w:r>
-        <w:rPr>
-          <w:rFonts w:ascii="Times New Roman" w:hAnsi="Times New Roman"/>
-          <w:bCs/>
-          <w:noProof/>
-          <w:color w:val="000000"/>
-          <w:sz w:val="22"/>
-          <w:szCs w:val="22"/>
-          <w:u w:val="single"/>
-        </w:rPr>
-        <w:t> </w:t>
-      </w:r>
-      <w:r>
-        <w:rPr>
-          <w:rFonts w:ascii="Times New Roman" w:hAnsi="Times New Roman"/>
-          <w:bCs/>
-          <w:noProof/>
-          <w:color w:val="000000"/>
-          <w:sz w:val="22"/>
-          <w:szCs w:val="22"/>
-          <w:u w:val="single"/>
-        </w:rPr>
-        <w:t> </w:t>
-      </w:r>
-      <w:r>
-        <w:rPr>
-          <w:rFonts w:ascii="Times New Roman" w:hAnsi="Times New Roman"/>
-          <w:bCs/>
-          <w:color w:val="000000"/>
-          <w:sz w:val="22"/>
-          <w:szCs w:val="22"/>
-          <w:u w:val="single"/>
-        </w:rPr>
-        <w:fldChar w:fldCharType="end"/>
       </w:r>
       <w:r>
         <w:rPr>
@@ -5517,7 +3398,7 @@
           <w:sz w:val="20"/>
         </w:rPr>
       </w:pPr>
-      <w:bookmarkStart w:id="4" w:name="_Hlk82177568"/>
+      <w:bookmarkStart w:id="2" w:name="_Hlk82177568"/>
       <w:r>
         <w:rPr>
           <w:rFonts w:ascii="Times New Roman" w:hAnsi="Times New Roman"/>
@@ -5561,7 +3442,7 @@
         <w:t>but are not limited to the following:</w:t>
       </w:r>
     </w:p>
-    <w:bookmarkEnd w:id="4"/>
+    <w:bookmarkEnd w:id="2"/>
     <w:p>
       <w:pPr>
         <w:pStyle w:val="ListParagraph"/>
@@ -9370,7 +7251,7 @@
         <w:t>?</w:t>
       </w:r>
     </w:p>
-    <w:bookmarkStart w:id="5" w:name="_Hlk13042833"/>
+    <w:bookmarkStart w:id="3" w:name="_Hlk13042833"/>
     <w:p>
       <w:pPr>
         <w:tabs>
@@ -9450,7 +7331,7 @@
         </w:rPr>
         <w:fldChar w:fldCharType="end"/>
       </w:r>
-      <w:bookmarkEnd w:id="5"/>
+      <w:bookmarkEnd w:id="3"/>
       <w:r>
         <w:rPr>
           <w:rFonts w:ascii="Times New Roman" w:hAnsi="Times New Roman"/>
@@ -13406,7 +11287,7 @@
           <w:sz w:val="20"/>
         </w:rPr>
       </w:pPr>
-      <w:bookmarkStart w:id="6" w:name="_Hlk81897352"/>
+      <w:bookmarkStart w:id="4" w:name="_Hlk81897352"/>
       <w:r>
         <w:rPr>
           <w:rFonts w:ascii="Times New Roman" w:hAnsi="Times New Roman"/>
@@ -13525,8 +11406,8 @@
                 <w:sz w:val="20"/>
               </w:rPr>
             </w:pPr>
-            <w:bookmarkStart w:id="7" w:name="_Hlk13036627"/>
-            <w:bookmarkEnd w:id="6"/>
+            <w:bookmarkStart w:id="5" w:name="_Hlk13036627"/>
+            <w:bookmarkEnd w:id="4"/>
             <w:r>
               <w:rPr>
                 <w:rFonts w:ascii="Times New Roman" w:hAnsi="Times New Roman"/>
@@ -15398,7 +13279,7 @@
           </w:p>
         </w:tc>
       </w:tr>
-      <w:bookmarkEnd w:id="7"/>
+      <w:bookmarkEnd w:id="5"/>
     </w:tbl>
     <w:p>
       <w:pPr>
@@ -20459,7 +18340,7 @@
           <w:sz w:val="20"/>
         </w:rPr>
       </w:pPr>
-      <w:bookmarkStart w:id="8" w:name="_Hlk66790075"/>
+      <w:bookmarkStart w:id="6" w:name="_Hlk66790075"/>
       <w:r>
         <w:rPr>
           <w:b/>
@@ -20701,8 +18582,8 @@
                 <w:sz w:val="20"/>
               </w:rPr>
             </w:pPr>
-            <w:bookmarkStart w:id="9" w:name="_Hlk13036372"/>
-            <w:bookmarkEnd w:id="8"/>
+            <w:bookmarkStart w:id="7" w:name="_Hlk13036372"/>
+            <w:bookmarkEnd w:id="6"/>
             <w:r>
               <w:rPr>
                 <w:rFonts w:ascii="Times New Roman" w:hAnsi="Times New Roman"/>
@@ -21704,7 +19585,7 @@
           </w:p>
         </w:tc>
       </w:tr>
-      <w:bookmarkEnd w:id="9"/>
+      <w:bookmarkEnd w:id="7"/>
     </w:tbl>
     <w:p>
       <w:pPr>
@@ -27220,7 +25101,7 @@
           <w:sz w:val="20"/>
         </w:rPr>
       </w:pPr>
-      <w:bookmarkStart w:id="10" w:name="_Hlk13039728"/>
+      <w:bookmarkStart w:id="8" w:name="_Hlk13039728"/>
       <w:r>
         <w:rPr>
           <w:b/>
@@ -27324,7 +25205,7 @@
         <w:t>.</w:t>
       </w:r>
     </w:p>
-    <w:bookmarkEnd w:id="10"/>
+    <w:bookmarkEnd w:id="8"/>
     <w:p>
       <w:pPr>
         <w:tabs>
@@ -31861,7 +29742,7 @@
           <w:szCs w:val="22"/>
         </w:rPr>
       </w:pPr>
-      <w:bookmarkStart w:id="11" w:name="_Hlk81902123"/>
+      <w:bookmarkStart w:id="9" w:name="_Hlk81902123"/>
       <w:r>
         <w:rPr>
           <w:b/>
@@ -31904,8 +29785,8 @@
           <w:sz w:val="20"/>
         </w:rPr>
       </w:pPr>
-      <w:bookmarkStart w:id="12" w:name="_Hlk81902201"/>
-      <w:bookmarkEnd w:id="11"/>
+      <w:bookmarkStart w:id="10" w:name="_Hlk81902201"/>
+      <w:bookmarkEnd w:id="9"/>
       <w:r>
         <w:rPr>
           <w:rFonts w:ascii="Times New Roman" w:hAnsi="Times New Roman"/>
@@ -32000,7 +29881,7 @@
           <w:tcPr>
             <w:tcW w:w="3685" w:type="dxa"/>
           </w:tcPr>
-          <w:bookmarkEnd w:id="12"/>
+          <w:bookmarkEnd w:id="10"/>
           <w:p>
             <w:pPr>
               <w:autoSpaceDE w:val="0"/>
@@ -38988,8 +36869,8 @@
       </w:r>
     </w:p>
     <w:sectPr>
-      <w:headerReference w:type="default" r:id="rId8"/>
-      <w:footerReference w:type="default" r:id="rId9"/>
+      <w:headerReference w:type="default" r:id="rId9"/>
+      <w:footerReference w:type="default" r:id="rId10"/>
       <w:pgSz w:w="12240" w:h="15840"/>
       <w:pgMar w:top="720" w:right="1152" w:bottom="432" w:left="1152" w:header="432" w:footer="720" w:gutter="0"/>
       <w:cols w:space="720"/>
@@ -39033,7 +36914,6 @@
         <w:docPartUnique/>
       </w:docPartObj>
     </w:sdtPr>
-    <w:sdtEndPr/>
     <w:sdtContent>
       <w:sdt>
         <w:sdtPr>
@@ -39048,7 +36928,6 @@
             <w:docPartUnique/>
           </w:docPartObj>
         </w:sdtPr>
-        <w:sdtEndPr/>
         <w:sdtContent>
           <w:p>
             <w:pPr>

</xml_diff>